<commit_message>
docs: add JISA submission statements
</commit_message>
<xml_diff>
--- a/docs/research/paper_v2/manuscript/M3_PI_Guard_JISA_working_draft.docx
+++ b/docs/research/paper_v2/manuscript/M3_PI_Guard_JISA_working_draft.docx
@@ -2,7 +2,7 @@
 <file path=word/document.xml><?xml version="1.0" encoding="utf-8"?>
 <w:document xmlns:w="http://schemas.openxmlformats.org/wordprocessingml/2006/main" xmlns:m="http://schemas.openxmlformats.org/officeDocument/2006/math" xmlns:r="http://schemas.openxmlformats.org/officeDocument/2006/relationships" xmlns:o="urn:schemas-microsoft-com:office:office" xmlns:v="urn:schemas-microsoft-com:vml" xmlns:w10="urn:schemas-microsoft-com:office:word" xmlns:a="http://schemas.openxmlformats.org/drawingml/2006/main" xmlns:pic="http://schemas.openxmlformats.org/drawingml/2006/picture" xmlns:wp="http://schemas.openxmlformats.org/drawingml/2006/wordprocessingDrawing">
   <w:body>
-    <w:bookmarkStart w:id="134" w:name="Xd9efb7391f2a5550bca577963c4515c86212927"/>
+    <w:bookmarkStart w:id="141" w:name="Xd9efb7391f2a5550bca577963c4515c86212927"/>
     <w:p>
       <w:pPr>
         <w:pStyle w:val="Heading1"/>
@@ -23218,18 +23218,257 @@
       </w:r>
     </w:p>
     <w:bookmarkEnd w:id="89"/>
-    <w:bookmarkStart w:id="133" w:name="references"/>
+    <w:bookmarkStart w:id="96" w:name="submission-statements"/>
     <w:p>
       <w:pPr>
         <w:pStyle w:val="Heading2"/>
         <w:keepNext/>
       </w:pPr>
       <w:r>
+        <w:t xml:space="preserve">Submission statements</w:t>
+      </w:r>
+    </w:p>
+    <w:bookmarkStart w:id="90" w:name="competing-interests"/>
+    <w:p>
+      <w:pPr>
+        <w:pStyle w:val="Heading3"/>
+        <w:keepNext/>
+      </w:pPr>
+      <w:r>
+        <w:t xml:space="preserve">Competing interests</w:t>
+      </w:r>
+    </w:p>
+    <w:p>
+      <w:pPr>
+        <w:pStyle w:val="FirstParagraph"/>
+      </w:pPr>
+      <w:r>
+        <w:t xml:space="preserve">The corresponding author must confirm the competing-interests declaration with</w:t>
+      </w:r>
+      <w:r>
+        <w:t xml:space="preserve"> </w:t>
+      </w:r>
+      <w:r>
+        <w:t xml:space="preserve">all authors before submission.</w:t>
+      </w:r>
+    </w:p>
+    <w:bookmarkEnd w:id="90"/>
+    <w:bookmarkStart w:id="91" w:name="funding"/>
+    <w:p>
+      <w:pPr>
+        <w:pStyle w:val="Heading3"/>
+        <w:keepNext/>
+      </w:pPr>
+      <w:r>
+        <w:t xml:space="preserve">Funding</w:t>
+      </w:r>
+    </w:p>
+    <w:p>
+      <w:pPr>
+        <w:pStyle w:val="FirstParagraph"/>
+      </w:pPr>
+      <w:r>
+        <w:t xml:space="preserve">The corresponding author must provide the funder name, grant number, and</w:t>
+      </w:r>
+      <w:r>
+        <w:t xml:space="preserve"> </w:t>
+      </w:r>
+      <w:r>
+        <w:t xml:space="preserve">sponsor role, or confirm that the research received no specific grant from</w:t>
+      </w:r>
+      <w:r>
+        <w:t xml:space="preserve"> </w:t>
+      </w:r>
+      <w:r>
+        <w:t xml:space="preserve">funding agencies in the public, commercial, or not-for-profit sectors.</w:t>
+      </w:r>
+    </w:p>
+    <w:bookmarkEnd w:id="91"/>
+    <w:bookmarkStart w:id="92" w:name="data-and-code-availability"/>
+    <w:p>
+      <w:pPr>
+        <w:pStyle w:val="Heading3"/>
+        <w:keepNext/>
+      </w:pPr>
+      <w:r>
+        <w:t xml:space="preserve">Data and code availability</w:t>
+      </w:r>
+    </w:p>
+    <w:p>
+      <w:pPr>
+        <w:pStyle w:val="FirstParagraph"/>
+      </w:pPr>
+      <w:r>
+        <w:t xml:space="preserve">The implementation, frozen lean experiment plan, analysis code, aggregate</w:t>
+      </w:r>
+      <w:r>
+        <w:t xml:space="preserve"> </w:t>
+      </w:r>
+      <w:r>
+        <w:t xml:space="preserve">tables, and editable figures are maintained at</w:t>
+      </w:r>
+      <w:r>
+        <w:t xml:space="preserve"> </w:t>
+      </w:r>
+      <w:r>
+        <w:t xml:space="preserve">https://github.com/Fischl0527/M3_PI_Guard. The repository is private during</w:t>
+      </w:r>
+      <w:r>
+        <w:t xml:space="preserve"> </w:t>
+      </w:r>
+      <w:r>
+        <w:t xml:space="preserve">manuscript preparation. A public archival release with an immutable version</w:t>
+      </w:r>
+      <w:r>
+        <w:t xml:space="preserve"> </w:t>
+      </w:r>
+      <w:r>
+        <w:t xml:space="preserve">identifier will be deposited before publication. Credentials and secrets are</w:t>
+      </w:r>
+      <w:r>
+        <w:t xml:space="preserve"> </w:t>
+      </w:r>
+      <w:r>
+        <w:t xml:space="preserve">excluded from the release. Any restrictions on provider-derived compact raw</w:t>
+      </w:r>
+      <w:r>
+        <w:t xml:space="preserve"> </w:t>
+      </w:r>
+      <w:r>
+        <w:t xml:space="preserve">records will be stated explicitly in the archival record.</w:t>
+      </w:r>
+    </w:p>
+    <w:bookmarkEnd w:id="92"/>
+    <w:bookmarkStart w:id="93" w:name="X071796dd6bc546c91e96cca1cf5ff96599de61f"/>
+    <w:p>
+      <w:pPr>
+        <w:pStyle w:val="Heading3"/>
+        <w:keepNext/>
+      </w:pPr>
+      <w:r>
+        <w:t xml:space="preserve">Declaration of generative AI and AI-assisted technologies in the writing process</w:t>
+      </w:r>
+    </w:p>
+    <w:p>
+      <w:pPr>
+        <w:pStyle w:val="FirstParagraph"/>
+      </w:pPr>
+      <w:r>
+        <w:t xml:space="preserve">During preparation of this work, the authors used OpenAI Codex for software</w:t>
+      </w:r>
+      <w:r>
+        <w:t xml:space="preserve"> </w:t>
+      </w:r>
+      <w:r>
+        <w:t xml:space="preserve">editing, statistical-script review, figure-generation support, and language</w:t>
+      </w:r>
+      <w:r>
+        <w:t xml:space="preserve"> </w:t>
+      </w:r>
+      <w:r>
+        <w:t xml:space="preserve">revision. The authors reviewed and revised the resulting material and take</w:t>
+      </w:r>
+      <w:r>
+        <w:t xml:space="preserve"> </w:t>
+      </w:r>
+      <w:r>
+        <w:t xml:space="preserve">full responsibility for the analysis, interpretation, citations, and</w:t>
+      </w:r>
+      <w:r>
+        <w:t xml:space="preserve"> </w:t>
+      </w:r>
+      <w:r>
+        <w:t xml:space="preserve">manuscript content. DeepSeek and Gemini are evaluated research systems in this</w:t>
+      </w:r>
+      <w:r>
+        <w:t xml:space="preserve"> </w:t>
+      </w:r>
+      <w:r>
+        <w:t xml:space="preserve">study rather than writing assistants.</w:t>
+      </w:r>
+    </w:p>
+    <w:bookmarkEnd w:id="93"/>
+    <w:bookmarkStart w:id="94" w:name="ethics-and-safety"/>
+    <w:p>
+      <w:pPr>
+        <w:pStyle w:val="Heading3"/>
+        <w:keepNext/>
+      </w:pPr>
+      <w:r>
+        <w:t xml:space="preserve">Ethics and safety</w:t>
+      </w:r>
+    </w:p>
+    <w:p>
+      <w:pPr>
+        <w:pStyle w:val="FirstParagraph"/>
+      </w:pPr>
+      <w:r>
+        <w:t xml:space="preserve">The study involved no human participants and collected no personal data. Tool</w:t>
+      </w:r>
+      <w:r>
+        <w:t xml:space="preserve"> </w:t>
+      </w:r>
+      <w:r>
+        <w:t xml:space="preserve">effects were evaluated in isolated benchmark state. Real email, payment,</w:t>
+      </w:r>
+      <w:r>
+        <w:t xml:space="preserve"> </w:t>
+      </w:r>
+      <w:r>
+        <w:t xml:space="preserve">browser, code-execution, production-API, and provider-managed tool operations</w:t>
+      </w:r>
+      <w:r>
+        <w:t xml:space="preserve"> </w:t>
+      </w:r>
+      <w:r>
+        <w:t xml:space="preserve">were disabled. The authors must confirm any institutional review or exemption</w:t>
+      </w:r>
+      <w:r>
+        <w:t xml:space="preserve"> </w:t>
+      </w:r>
+      <w:r>
+        <w:t xml:space="preserve">requirement before submission.</w:t>
+      </w:r>
+    </w:p>
+    <w:bookmarkEnd w:id="94"/>
+    <w:bookmarkStart w:id="95" w:name="author-contributions"/>
+    <w:p>
+      <w:pPr>
+        <w:pStyle w:val="Heading3"/>
+        <w:keepNext/>
+      </w:pPr>
+      <w:r>
+        <w:t xml:space="preserve">Author contributions</w:t>
+      </w:r>
+    </w:p>
+    <w:p>
+      <w:pPr>
+        <w:pStyle w:val="FirstParagraph"/>
+      </w:pPr>
+      <w:r>
+        <w:t xml:space="preserve">Author order and CRediT roles must be approved by every author before</w:t>
+      </w:r>
+      <w:r>
+        <w:t xml:space="preserve"> </w:t>
+      </w:r>
+      <w:r>
+        <w:t xml:space="preserve">submission.</w:t>
+      </w:r>
+    </w:p>
+    <w:bookmarkEnd w:id="95"/>
+    <w:bookmarkEnd w:id="96"/>
+    <w:bookmarkStart w:id="140" w:name="references"/>
+    <w:p>
+      <w:pPr>
+        <w:pStyle w:val="Heading2"/>
+        <w:keepNext/>
+      </w:pPr>
+      <w:r>
         <w:t xml:space="preserve">References</w:t>
       </w:r>
     </w:p>
-    <w:bookmarkStart w:id="132" w:name="refs"/>
-    <w:bookmarkStart w:id="91" w:name="ref-L25"/>
+    <w:bookmarkStart w:id="139" w:name="refs"/>
+    <w:bookmarkStart w:id="98" w:name="ref-L25"/>
     <w:p>
       <w:pPr>
         <w:pStyle w:val="Bibliography"/>
@@ -23283,7 +23522,7 @@
       <w:r>
         <w:t xml:space="preserve"> </w:t>
       </w:r>
-      <w:hyperlink r:id="rId90">
+      <w:hyperlink r:id="rId97">
         <w:r>
           <w:rPr>
             <w:rStyle w:val="Hyperlink"/>
@@ -23295,8 +23534,8 @@
         <w:t xml:space="preserve">.</w:t>
       </w:r>
     </w:p>
-    <w:bookmarkEnd w:id="91"/>
-    <w:bookmarkStart w:id="93" w:name="ref-L07"/>
+    <w:bookmarkEnd w:id="98"/>
+    <w:bookmarkStart w:id="100" w:name="ref-L07"/>
     <w:p>
       <w:pPr>
         <w:pStyle w:val="Bibliography"/>
@@ -23338,7 +23577,7 @@
       <w:r>
         <w:t xml:space="preserve"> </w:t>
       </w:r>
-      <w:hyperlink r:id="rId92">
+      <w:hyperlink r:id="rId99">
         <w:r>
           <w:rPr>
             <w:rStyle w:val="Hyperlink"/>
@@ -23350,8 +23589,8 @@
         <w:t xml:space="preserve">.</w:t>
       </w:r>
     </w:p>
-    <w:bookmarkEnd w:id="93"/>
-    <w:bookmarkStart w:id="95" w:name="ref-L32"/>
+    <w:bookmarkEnd w:id="100"/>
+    <w:bookmarkStart w:id="102" w:name="ref-L32"/>
     <w:p>
       <w:pPr>
         <w:pStyle w:val="Bibliography"/>
@@ -23387,7 +23626,7 @@
       <w:r>
         <w:t xml:space="preserve"> </w:t>
       </w:r>
-      <w:hyperlink r:id="rId94">
+      <w:hyperlink r:id="rId101">
         <w:r>
           <w:rPr>
             <w:rStyle w:val="Hyperlink"/>
@@ -23399,8 +23638,8 @@
         <w:t xml:space="preserve">.</w:t>
       </w:r>
     </w:p>
-    <w:bookmarkEnd w:id="95"/>
-    <w:bookmarkStart w:id="97" w:name="ref-L26"/>
+    <w:bookmarkEnd w:id="102"/>
+    <w:bookmarkStart w:id="104" w:name="ref-L26"/>
     <w:p>
       <w:pPr>
         <w:pStyle w:val="Bibliography"/>
@@ -23417,7 +23656,7 @@
       <w:r>
         <w:t xml:space="preserve"> </w:t>
       </w:r>
-      <w:hyperlink r:id="rId96">
+      <w:hyperlink r:id="rId103">
         <w:r>
           <w:rPr>
             <w:rStyle w:val="Hyperlink"/>
@@ -23429,8 +23668,8 @@
         <w:t xml:space="preserve">.</w:t>
       </w:r>
     </w:p>
-    <w:bookmarkEnd w:id="97"/>
-    <w:bookmarkStart w:id="99" w:name="ref-L09"/>
+    <w:bookmarkEnd w:id="104"/>
+    <w:bookmarkStart w:id="106" w:name="ref-L09"/>
     <w:p>
       <w:pPr>
         <w:pStyle w:val="Bibliography"/>
@@ -23463,7 +23702,7 @@
       <w:r>
         <w:t xml:space="preserve"> </w:t>
       </w:r>
-      <w:hyperlink r:id="rId98">
+      <w:hyperlink r:id="rId105">
         <w:r>
           <w:rPr>
             <w:rStyle w:val="Hyperlink"/>
@@ -23475,8 +23714,8 @@
         <w:t xml:space="preserve">.</w:t>
       </w:r>
     </w:p>
-    <w:bookmarkEnd w:id="99"/>
-    <w:bookmarkStart w:id="101" w:name="ref-L23"/>
+    <w:bookmarkEnd w:id="106"/>
+    <w:bookmarkStart w:id="108" w:name="ref-L23"/>
     <w:p>
       <w:pPr>
         <w:pStyle w:val="Bibliography"/>
@@ -23493,7 +23732,7 @@
       <w:r>
         <w:t xml:space="preserve"> </w:t>
       </w:r>
-      <w:hyperlink r:id="rId100">
+      <w:hyperlink r:id="rId107">
         <w:r>
           <w:rPr>
             <w:rStyle w:val="Hyperlink"/>
@@ -23505,8 +23744,8 @@
         <w:t xml:space="preserve">.</w:t>
       </w:r>
     </w:p>
-    <w:bookmarkEnd w:id="101"/>
-    <w:bookmarkStart w:id="103" w:name="ref-L30"/>
+    <w:bookmarkEnd w:id="108"/>
+    <w:bookmarkStart w:id="110" w:name="ref-L30"/>
     <w:p>
       <w:pPr>
         <w:pStyle w:val="Bibliography"/>
@@ -23523,7 +23762,7 @@
       <w:r>
         <w:t xml:space="preserve"> </w:t>
       </w:r>
-      <w:hyperlink r:id="rId102">
+      <w:hyperlink r:id="rId109">
         <w:r>
           <w:rPr>
             <w:rStyle w:val="Hyperlink"/>
@@ -23535,8 +23774,8 @@
         <w:t xml:space="preserve">.</w:t>
       </w:r>
     </w:p>
-    <w:bookmarkEnd w:id="103"/>
-    <w:bookmarkStart w:id="105" w:name="ref-L03"/>
+    <w:bookmarkEnd w:id="110"/>
+    <w:bookmarkStart w:id="112" w:name="ref-L03"/>
     <w:p>
       <w:pPr>
         <w:pStyle w:val="Bibliography"/>
@@ -23584,7 +23823,7 @@
       <w:r>
         <w:t xml:space="preserve"> </w:t>
       </w:r>
-      <w:hyperlink r:id="rId104">
+      <w:hyperlink r:id="rId111">
         <w:r>
           <w:rPr>
             <w:rStyle w:val="Hyperlink"/>
@@ -23596,8 +23835,8 @@
         <w:t xml:space="preserve">.</w:t>
       </w:r>
     </w:p>
-    <w:bookmarkEnd w:id="105"/>
-    <w:bookmarkStart w:id="107" w:name="ref-L02"/>
+    <w:bookmarkEnd w:id="112"/>
+    <w:bookmarkStart w:id="114" w:name="ref-L02"/>
     <w:p>
       <w:pPr>
         <w:pStyle w:val="Bibliography"/>
@@ -23630,7 +23869,7 @@
       <w:r>
         <w:t xml:space="preserve"> </w:t>
       </w:r>
-      <w:hyperlink r:id="rId106">
+      <w:hyperlink r:id="rId113">
         <w:r>
           <w:rPr>
             <w:rStyle w:val="Hyperlink"/>
@@ -23642,8 +23881,8 @@
         <w:t xml:space="preserve">.</w:t>
       </w:r>
     </w:p>
-    <w:bookmarkEnd w:id="107"/>
-    <w:bookmarkStart w:id="109" w:name="ref-L35"/>
+    <w:bookmarkEnd w:id="114"/>
+    <w:bookmarkStart w:id="116" w:name="ref-L35"/>
     <w:p>
       <w:pPr>
         <w:pStyle w:val="Bibliography"/>
@@ -23660,7 +23899,7 @@
       <w:r>
         <w:t xml:space="preserve"> </w:t>
       </w:r>
-      <w:hyperlink r:id="rId108">
+      <w:hyperlink r:id="rId115">
         <w:r>
           <w:rPr>
             <w:rStyle w:val="Hyperlink"/>
@@ -23672,8 +23911,8 @@
         <w:t xml:space="preserve">.</w:t>
       </w:r>
     </w:p>
-    <w:bookmarkEnd w:id="109"/>
-    <w:bookmarkStart w:id="111" w:name="ref-L01"/>
+    <w:bookmarkEnd w:id="116"/>
+    <w:bookmarkStart w:id="118" w:name="ref-L01"/>
     <w:p>
       <w:pPr>
         <w:pStyle w:val="Bibliography"/>
@@ -23790,7 +24029,7 @@
       <w:r>
         <w:t xml:space="preserve"> </w:t>
       </w:r>
-      <w:hyperlink r:id="rId110">
+      <w:hyperlink r:id="rId117">
         <w:r>
           <w:rPr>
             <w:rStyle w:val="Hyperlink"/>
@@ -23802,8 +24041,8 @@
         <w:t xml:space="preserve">.</w:t>
       </w:r>
     </w:p>
-    <w:bookmarkEnd w:id="111"/>
-    <w:bookmarkStart w:id="113" w:name="ref-L27"/>
+    <w:bookmarkEnd w:id="118"/>
+    <w:bookmarkStart w:id="120" w:name="ref-L27"/>
     <w:p>
       <w:pPr>
         <w:pStyle w:val="Bibliography"/>
@@ -23820,7 +24059,7 @@
       <w:r>
         <w:t xml:space="preserve"> </w:t>
       </w:r>
-      <w:hyperlink r:id="rId112">
+      <w:hyperlink r:id="rId119">
         <w:r>
           <w:rPr>
             <w:rStyle w:val="Hyperlink"/>
@@ -23832,8 +24071,8 @@
         <w:t xml:space="preserve">.</w:t>
       </w:r>
     </w:p>
-    <w:bookmarkEnd w:id="113"/>
-    <w:bookmarkStart w:id="115" w:name="ref-L24"/>
+    <w:bookmarkEnd w:id="120"/>
+    <w:bookmarkStart w:id="122" w:name="ref-L24"/>
     <w:p>
       <w:pPr>
         <w:pStyle w:val="Bibliography"/>
@@ -23850,7 +24089,7 @@
       <w:r>
         <w:t xml:space="preserve"> </w:t>
       </w:r>
-      <w:hyperlink r:id="rId114">
+      <w:hyperlink r:id="rId121">
         <w:r>
           <w:rPr>
             <w:rStyle w:val="Hyperlink"/>
@@ -23862,8 +24101,8 @@
         <w:t xml:space="preserve">.</w:t>
       </w:r>
     </w:p>
-    <w:bookmarkEnd w:id="115"/>
-    <w:bookmarkStart w:id="117" w:name="ref-L08"/>
+    <w:bookmarkEnd w:id="122"/>
+    <w:bookmarkStart w:id="124" w:name="ref-L08"/>
     <w:p>
       <w:pPr>
         <w:pStyle w:val="Bibliography"/>
@@ -23899,7 +24138,7 @@
       <w:r>
         <w:t xml:space="preserve"> </w:t>
       </w:r>
-      <w:hyperlink r:id="rId116">
+      <w:hyperlink r:id="rId123">
         <w:r>
           <w:rPr>
             <w:rStyle w:val="Hyperlink"/>
@@ -23911,8 +24150,8 @@
         <w:t xml:space="preserve">.</w:t>
       </w:r>
     </w:p>
-    <w:bookmarkEnd w:id="117"/>
-    <w:bookmarkStart w:id="119" w:name="ref-L31"/>
+    <w:bookmarkEnd w:id="124"/>
+    <w:bookmarkStart w:id="126" w:name="ref-L31"/>
     <w:p>
       <w:pPr>
         <w:pStyle w:val="Bibliography"/>
@@ -23929,7 +24168,7 @@
       <w:r>
         <w:t xml:space="preserve"> </w:t>
       </w:r>
-      <w:hyperlink r:id="rId118">
+      <w:hyperlink r:id="rId125">
         <w:r>
           <w:rPr>
             <w:rStyle w:val="Hyperlink"/>
@@ -23941,8 +24180,8 @@
         <w:t xml:space="preserve">.</w:t>
       </w:r>
     </w:p>
-    <w:bookmarkEnd w:id="119"/>
-    <w:bookmarkStart w:id="121" w:name="ref-L20"/>
+    <w:bookmarkEnd w:id="126"/>
+    <w:bookmarkStart w:id="128" w:name="ref-L20"/>
     <w:p>
       <w:pPr>
         <w:pStyle w:val="Bibliography"/>
@@ -23978,7 +24217,7 @@
       <w:r>
         <w:t xml:space="preserve"> </w:t>
       </w:r>
-      <w:hyperlink r:id="rId120">
+      <w:hyperlink r:id="rId127">
         <w:r>
           <w:rPr>
             <w:rStyle w:val="Hyperlink"/>
@@ -23990,8 +24229,8 @@
         <w:t xml:space="preserve">.</w:t>
       </w:r>
     </w:p>
-    <w:bookmarkEnd w:id="121"/>
-    <w:bookmarkStart w:id="123" w:name="ref-L22"/>
+    <w:bookmarkEnd w:id="128"/>
+    <w:bookmarkStart w:id="130" w:name="ref-L22"/>
     <w:p>
       <w:pPr>
         <w:pStyle w:val="Bibliography"/>
@@ -24008,7 +24247,7 @@
       <w:r>
         <w:t xml:space="preserve"> </w:t>
       </w:r>
-      <w:hyperlink r:id="rId122">
+      <w:hyperlink r:id="rId129">
         <w:r>
           <w:rPr>
             <w:rStyle w:val="Hyperlink"/>
@@ -24020,8 +24259,8 @@
         <w:t xml:space="preserve">.</w:t>
       </w:r>
     </w:p>
-    <w:bookmarkEnd w:id="123"/>
-    <w:bookmarkStart w:id="125" w:name="ref-L21"/>
+    <w:bookmarkEnd w:id="130"/>
+    <w:bookmarkStart w:id="132" w:name="ref-L21"/>
     <w:p>
       <w:pPr>
         <w:pStyle w:val="Bibliography"/>
@@ -24038,7 +24277,7 @@
       <w:r>
         <w:t xml:space="preserve"> </w:t>
       </w:r>
-      <w:hyperlink r:id="rId124">
+      <w:hyperlink r:id="rId131">
         <w:r>
           <w:rPr>
             <w:rStyle w:val="Hyperlink"/>
@@ -24050,8 +24289,8 @@
         <w:t xml:space="preserve">.</w:t>
       </w:r>
     </w:p>
-    <w:bookmarkEnd w:id="125"/>
-    <w:bookmarkStart w:id="127" w:name="ref-L10"/>
+    <w:bookmarkEnd w:id="132"/>
+    <w:bookmarkStart w:id="134" w:name="ref-L10"/>
     <w:p>
       <w:pPr>
         <w:pStyle w:val="Bibliography"/>
@@ -24099,7 +24338,7 @@
       <w:r>
         <w:t xml:space="preserve"> </w:t>
       </w:r>
-      <w:hyperlink r:id="rId126">
+      <w:hyperlink r:id="rId133">
         <w:r>
           <w:rPr>
             <w:rStyle w:val="Hyperlink"/>
@@ -24111,8 +24350,8 @@
         <w:t xml:space="preserve">.</w:t>
       </w:r>
     </w:p>
-    <w:bookmarkEnd w:id="127"/>
-    <w:bookmarkStart w:id="129" w:name="ref-L34"/>
+    <w:bookmarkEnd w:id="134"/>
+    <w:bookmarkStart w:id="136" w:name="ref-L34"/>
     <w:p>
       <w:pPr>
         <w:pStyle w:val="Bibliography"/>
@@ -24145,7 +24384,7 @@
       <w:r>
         <w:t xml:space="preserve"> </w:t>
       </w:r>
-      <w:hyperlink r:id="rId128">
+      <w:hyperlink r:id="rId135">
         <w:r>
           <w:rPr>
             <w:rStyle w:val="Hyperlink"/>
@@ -24157,8 +24396,8 @@
         <w:t xml:space="preserve">.</w:t>
       </w:r>
     </w:p>
-    <w:bookmarkEnd w:id="129"/>
-    <w:bookmarkStart w:id="131" w:name="ref-L36"/>
+    <w:bookmarkEnd w:id="136"/>
+    <w:bookmarkStart w:id="138" w:name="ref-L36"/>
     <w:p>
       <w:pPr>
         <w:pStyle w:val="Bibliography"/>
@@ -24175,7 +24414,7 @@
       <w:r>
         <w:t xml:space="preserve"> </w:t>
       </w:r>
-      <w:hyperlink r:id="rId130">
+      <w:hyperlink r:id="rId137">
         <w:r>
           <w:rPr>
             <w:rStyle w:val="Hyperlink"/>
@@ -24187,10 +24426,10 @@
         <w:t xml:space="preserve">.</w:t>
       </w:r>
     </w:p>
-    <w:bookmarkEnd w:id="131"/>
-    <w:bookmarkEnd w:id="132"/>
-    <w:bookmarkEnd w:id="133"/>
-    <w:bookmarkEnd w:id="134"/>
+    <w:bookmarkEnd w:id="138"/>
+    <w:bookmarkEnd w:id="139"/>
+    <w:bookmarkEnd w:id="140"/>
+    <w:bookmarkEnd w:id="141"/>
     <w:sectPr>
       <w:headerReference w:type="default" r:id="rId9"/>
       <w:footerReference w:type="default" r:id="rId10"/>

</xml_diff>

<commit_message>
docs: verify active manuscript citations
</commit_message>
<xml_diff>
--- a/docs/research/paper_v2/manuscript/M3_PI_Guard_JISA_working_draft.docx
+++ b/docs/research/paper_v2/manuscript/M3_PI_Guard_JISA_working_draft.docx
@@ -353,7 +353,7 @@
         <w:t xml:space="preserve"> </w:t>
       </w:r>
       <w:r>
-        <w:t xml:space="preserve">(Lin et al. 2026; Li et al. 2026; Jia et al. 2025; H. Wang, Poskitt, and Sun 2026; An et al. 2025)</w:t>
+        <w:t xml:space="preserve">(Lin et al. 2026; Li et al. 2025; Jia et al. 2025; H. Wang, Poskitt, and Sun 2026; An et al. 2025)</w:t>
       </w:r>
       <w:r>
         <w:t xml:space="preserve">.</w:t>
@@ -1309,7 +1309,7 @@
         <w:t xml:space="preserve"> </w:t>
       </w:r>
       <w:r>
-        <w:t xml:space="preserve">(Li et al. 2026)</w:t>
+        <w:t xml:space="preserve">(Li et al. 2025)</w:t>
       </w:r>
       <w:r>
         <w:t xml:space="preserve">.</w:t>
@@ -12152,7 +12152,7 @@
         <w:t xml:space="preserve"> </w:t>
       </w:r>
       <w:r>
-        <w:t xml:space="preserve">(Lin et al. 2026; Li et al. 2026; Jia et al. 2025; Weng et al. 2026; P. Wang, Li, and Tian 2026; Shi et al. 2025; An et al. 2025; Debenedetti et al. 2025; Liao 2026; Y. Zhang et al. 2026)</w:t>
+        <w:t xml:space="preserve">(Lin et al. 2026; Li et al. 2025; Jia et al. 2025; Weng et al. 2026; P. Wang, Li, and Tian 2026; Shi et al. 2025; An et al. 2025; Debenedetti et al. 2025; Liao 2026; Y. Zhang et al. 2026)</w:t>
       </w:r>
       <w:r>
         <w:t xml:space="preserve">. These</w:t>
@@ -23842,7 +23842,7 @@
         <w:pStyle w:val="Bibliography"/>
       </w:pPr>
       <w:r>
-        <w:t xml:space="preserve">Li, Hao, Xiaogeng Liu, CHIU Chun, Dianqi Li, Ning Zhang, and Chaowei Xiao. 2026.</w:t>
+        <w:t xml:space="preserve">Li, Hao, Xiaogeng Liu, CHIU Chun, Dianqi Li, Ning Zhang, and Chaowei Xiao. 2025.</w:t>
       </w:r>
       <w:r>
         <w:t xml:space="preserve"> </w:t>
@@ -23874,7 +23874,7 @@
           <w:rPr>
             <w:rStyle w:val="Hyperlink"/>
           </w:rPr>
-          <w:t xml:space="preserve">https://proceedings.neurips.cc/paper_files/paper/2025/hash/77f3b26c7907aa27b207df9b9d43f29a-Abstract-Conference.html</w:t>
+          <w:t xml:space="preserve">https://doi.org/10.52202/085713-2791</w:t>
         </w:r>
       </w:hyperlink>
       <w:r>
@@ -24212,7 +24212,7 @@
         <w:t xml:space="preserve">2026 IEEE/ACM 48th International Conference on Software Engineering (ICSE)</w:t>
       </w:r>
       <w:r>
-        <w:t xml:space="preserve">, 1–12.</w:t>
+        <w:t xml:space="preserve">.</w:t>
       </w:r>
       <w:r>
         <w:t xml:space="preserve"> </w:t>
@@ -24222,7 +24222,7 @@
           <w:rPr>
             <w:rStyle w:val="Hyperlink"/>
           </w:rPr>
-          <w:t xml:space="preserve">https://doi.org/10.1145/3744916.3764546</w:t>
+          <w:t xml:space="preserve">https://conf.researchr.org/details/icse-2026/icse-2026-research-track/29/AgentSpec-Customizable-Runtime-Enforcement-for-Safe-and-Reliable-LLM-Agents</w:t>
         </w:r>
       </w:hyperlink>
       <w:r>

</xml_diff>

<commit_message>
docs: refine JISA manuscript prose
</commit_message>
<xml_diff>
--- a/docs/research/paper_v2/manuscript/M3_PI_Guard_JISA_working_draft.docx
+++ b/docs/research/paper_v2/manuscript/M3_PI_Guard_JISA_working_draft.docx
@@ -625,7 +625,7 @@
           <w:bCs/>
           <w:b/>
         </w:rPr>
-        <w:t xml:space="preserve">RQ1 — Authorization regime.</w:t>
+        <w:t xml:space="preserve">RQ1: Authorization regime.</w:t>
       </w:r>
       <w:r>
         <w:t xml:space="preserve"> </w:t>
@@ -731,7 +731,7 @@
           <w:bCs/>
           <w:b/>
         </w:rPr>
-        <w:t xml:space="preserve">RQ2 — Module contribution.</w:t>
+        <w:t xml:space="preserve">RQ2: Module contribution.</w:t>
       </w:r>
       <w:r>
         <w:t xml:space="preserve"> </w:t>
@@ -765,7 +765,7 @@
           <w:bCs/>
           <w:b/>
         </w:rPr>
-        <w:t xml:space="preserve">RQ3 — External validity and adaptive budget.</w:t>
+        <w:t xml:space="preserve">RQ3: External validity and adaptive budget.</w:t>
       </w:r>
       <w:r>
         <w:t xml:space="preserve"> </w:t>
@@ -946,14 +946,14 @@
       </w:r>
     </w:p>
     <w:bookmarkEnd w:id="24"/>
-    <w:bookmarkStart w:id="25" w:name="current-evidence-and-route-decision"/>
+    <w:bookmarkStart w:id="25" w:name="empirical-motivation-and-study-framing"/>
     <w:p>
       <w:pPr>
         <w:pStyle w:val="Heading3"/>
         <w:keepNext/>
       </w:pPr>
       <w:r>
-        <w:t xml:space="preserve">1.5 Current evidence and route decision</w:t>
+        <w:t xml:space="preserve">1.5 Empirical motivation and study framing</w:t>
       </w:r>
     </w:p>
     <w:p>
@@ -961,7 +961,13 @@
         <w:pStyle w:val="FirstParagraph"/>
       </w:pPr>
       <w:r>
-        <w:t xml:space="preserve">The completed medium study rejected the mechanism-paper route. M3-full reduced</w:t>
+        <w:t xml:space="preserve">The completed medium falsification study did not support an incremental</w:t>
+      </w:r>
+      <w:r>
+        <w:t xml:space="preserve"> </w:t>
+      </w:r>
+      <w:r>
+        <w:t xml:space="preserve">mechanism claim. M3-full reduced</w:t>
       </w:r>
       <w:r>
         <w:t xml:space="preserve"> </w:t>
@@ -985,19 +991,19 @@
         <w:t xml:space="preserve"> </w:t>
       </w:r>
       <w:r>
-        <w:t xml:space="preserve">non-inferiority margin. The contribution is therefore an empirical study of</w:t>
-      </w:r>
-      <w:r>
-        <w:t xml:space="preserve"> </w:t>
-      </w:r>
-      <w:r>
-        <w:t xml:space="preserve">authorization uncertainty and the security–utility frontier, not a claim that</w:t>
-      </w:r>
-      <w:r>
-        <w:t xml:space="preserve"> </w:t>
-      </w:r>
-      <w:r>
-        <w:t xml:space="preserve">M3-full is a new or state-of-the-art defense.</w:t>
+        <w:t xml:space="preserve">non-inferiority margin. These observations motivate an empirical study of</w:t>
+      </w:r>
+      <w:r>
+        <w:t xml:space="preserve"> </w:t>
+      </w:r>
+      <w:r>
+        <w:t xml:space="preserve">authorization uncertainty and the security–utility frontier rather than a</w:t>
+      </w:r>
+      <w:r>
+        <w:t xml:space="preserve"> </w:t>
+      </w:r>
+      <w:r>
+        <w:t xml:space="preserve">claim that M3-full is a new or state-of-the-art defense.</w:t>
       </w:r>
     </w:p>
     <w:p>
@@ -1005,13 +1011,13 @@
         <w:pStyle w:val="BodyText"/>
       </w:pPr>
       <w:r>
-        <w:t xml:space="preserve">The independently reproduced Public primary matrix preserves this route at</w:t>
-      </w:r>
-      <w:r>
-        <w:t xml:space="preserve"> </w:t>
-      </w:r>
-      <w:r>
-        <w:t xml:space="preserve">larger scale. Across 600 attacks, M3-full reduced unsafe effects from 133 under</w:t>
+        <w:t xml:space="preserve">The larger, independently reproduced Public primary matrix reinforced this</w:t>
+      </w:r>
+      <w:r>
+        <w:t xml:space="preserve"> </w:t>
+      </w:r>
+      <w:r>
+        <w:t xml:space="preserve">finding. Across 600 attacks, M3-full reduced unsafe effects from 133 under</w:t>
       </w:r>
       <w:r>
         <w:t xml:space="preserve"> </w:t>
@@ -1035,19 +1041,19 @@
         <w:t xml:space="preserve"> </w:t>
       </w:r>
       <w:r>
-        <w:t xml:space="preserve">security nor utility value beyond policy-only in the completed primary-model</w:t>
-      </w:r>
-      <w:r>
-        <w:t xml:space="preserve"> </w:t>
-      </w:r>
-      <w:r>
-        <w:t xml:space="preserve">evidence. The 1.4955% retained diagnostic fraction also exceeds the frozen 1%</w:t>
-      </w:r>
-      <w:r>
-        <w:t xml:space="preserve"> </w:t>
-      </w:r>
-      <w:r>
-        <w:t xml:space="preserve">clean-mechanism quality ceiling.</w:t>
+        <w:t xml:space="preserve">security nor utility value beyond policy-only in the primary-model evidence.</w:t>
+      </w:r>
+      <w:r>
+        <w:t xml:space="preserve"> </w:t>
+      </w:r>
+      <w:r>
+        <w:t xml:space="preserve">The 1.4955% retained diagnostic fraction also exceeds the predefined 1%</w:t>
+      </w:r>
+      <w:r>
+        <w:t xml:space="preserve"> </w:t>
+      </w:r>
+      <w:r>
+        <w:t xml:space="preserve">threshold for a clean mechanism-quality claim.</w:t>
       </w:r>
     </w:p>
     <w:p>
@@ -2139,7 +2145,7 @@
           <w:bCs/>
           <w:b/>
         </w:rPr>
-        <w:t xml:space="preserve">RQ1 — Authorization regime.</w:t>
+        <w:t xml:space="preserve">RQ1: Authorization regime.</w:t>
       </w:r>
       <w:r>
         <w:t xml:space="preserve"> </w:t>
@@ -2245,7 +2251,7 @@
           <w:bCs/>
           <w:b/>
         </w:rPr>
-        <w:t xml:space="preserve">RQ2 — Mechanism contribution.</w:t>
+        <w:t xml:space="preserve">RQ2: Mechanism contribution.</w:t>
       </w:r>
       <w:r>
         <w:t xml:space="preserve"> </w:t>
@@ -2279,7 +2285,7 @@
           <w:bCs/>
           <w:b/>
         </w:rPr>
-        <w:t xml:space="preserve">RQ3 — External validity and adaptive budget.</w:t>
+        <w:t xml:space="preserve">RQ3: External validity and adaptive budget.</w:t>
       </w:r>
       <w:r>
         <w:t xml:space="preserve"> </w:t>
@@ -2476,7 +2482,7 @@
         <w:t xml:space="preserve"> </w:t>
       </w:r>
       <w:r>
-        <w:t xml:space="preserve">completed fields include trusted user intent, the benchmark-visible task</w:t>
+        <w:t xml:space="preserve">Permitted fields include trusted user intent, the benchmark-visible task</w:t>
       </w:r>
       <w:r>
         <w:t xml:space="preserve"> </w:t>
@@ -3454,31 +3460,31 @@
         <w:t xml:space="preserve"> </w:t>
       </w:r>
       <w:r>
-        <w:t xml:space="preserve">response are eligible for explicit recovery. After three quota-day attempts,</w:t>
-      </w:r>
-      <w:r>
-        <w:t xml:space="preserve"> </w:t>
-      </w:r>
-      <w:r>
-        <w:t xml:space="preserve">any still incomplete response-less work item is retained as a terminal</w:t>
-      </w:r>
-      <w:r>
-        <w:t xml:space="preserve"> </w:t>
-      </w:r>
-      <w:r>
-        <w:t xml:space="preserve">diagnostic. If the 450 planned items do not become terminal within that rule,</w:t>
-      </w:r>
-      <w:r>
-        <w:t xml:space="preserve"> </w:t>
-      </w:r>
-      <w:r>
-        <w:t xml:space="preserve">the observed subset is reported as diagnostic and no cross-provider</w:t>
-      </w:r>
-      <w:r>
-        <w:t xml:space="preserve"> </w:t>
-      </w:r>
-      <w:r>
-        <w:t xml:space="preserve">generalization claim is made.</w:t>
+        <w:t xml:space="preserve">response are eligible for explicit recovery. A rate-limited work item becomes</w:t>
+      </w:r>
+      <w:r>
+        <w:t xml:space="preserve"> </w:t>
+      </w:r>
+      <w:r>
+        <w:t xml:space="preserve">a terminal diagnostic on its third quota-day attempt. If the 450-item plan</w:t>
+      </w:r>
+      <w:r>
+        <w:t xml:space="preserve"> </w:t>
+      </w:r>
+      <w:r>
+        <w:t xml:space="preserve">still cannot be completed after three provider quota days, the observed subset</w:t>
+      </w:r>
+      <w:r>
+        <w:t xml:space="preserve"> </w:t>
+      </w:r>
+      <w:r>
+        <w:t xml:space="preserve">is reported diagnostically, unstarted work items are counted as unavailable,</w:t>
+      </w:r>
+      <w:r>
+        <w:t xml:space="preserve"> </w:t>
+      </w:r>
+      <w:r>
+        <w:t xml:space="preserve">and no cross-provider generalization claim is made.</w:t>
       </w:r>
     </w:p>
     <w:bookmarkEnd w:id="41"/>
@@ -3541,19 +3547,19 @@
         <w:t xml:space="preserve"> </w:t>
       </w:r>
       <w:r>
-        <w:t xml:space="preserve">Content-free request metadata and the provider’s internal trace remain under</w:t>
-      </w:r>
-      <w:r>
-        <w:t xml:space="preserve"> </w:t>
-      </w:r>
-      <w:r>
-        <w:t xml:space="preserve">the ignored run directory. Exact model identity is checked in the final</w:t>
-      </w:r>
-      <w:r>
-        <w:t xml:space="preserve"> </w:t>
-      </w:r>
-      <w:r>
-        <w:t xml:space="preserve">one-pass integrity validation.</w:t>
+        <w:t xml:space="preserve">Content-free request metadata and the provider’s internal trace remain in a</w:t>
+      </w:r>
+      <w:r>
+        <w:t xml:space="preserve"> </w:t>
+      </w:r>
+      <w:r>
+        <w:t xml:space="preserve">restricted local run directory outside the analysis dataset. Exact model</w:t>
+      </w:r>
+      <w:r>
+        <w:t xml:space="preserve"> </w:t>
+      </w:r>
+      <w:r>
+        <w:t xml:space="preserve">identity is checked in the final one-pass integrity validation.</w:t>
       </w:r>
     </w:p>
     <w:bookmarkEnd w:id="42"/>
@@ -4203,14 +4209,14 @@
         <w:t xml:space="preserve">4. Results</w:t>
       </w:r>
     </w:p>
-    <w:bookmarkStart w:id="52" w:name="medium-study-disposition"/>
+    <w:bookmarkStart w:id="52" w:name="medium-falsification-study"/>
     <w:p>
       <w:pPr>
         <w:pStyle w:val="Heading3"/>
         <w:keepNext/>
       </w:pPr>
       <w:r>
-        <w:t xml:space="preserve">4.1 Medium study disposition</w:t>
+        <w:t xml:space="preserve">4.1 Medium falsification study</w:t>
       </w:r>
     </w:p>
     <w:p>
@@ -4218,7 +4224,7 @@
         <w:pStyle w:val="FirstParagraph"/>
       </w:pPr>
       <w:r>
-        <w:t xml:space="preserve">The completed study contains 480 records: 432 primary</w:t>
+        <w:t xml:space="preserve">The medium study contains 480 records: 432 primary</w:t>
       </w:r>
       <w:r>
         <w:t xml:space="preserve"> </w:t>
@@ -4245,31 +4251,31 @@
         <w:t xml:space="preserve"> </w:t>
       </w:r>
       <w:r>
-        <w:t xml:space="preserve">probe records. The prespecified mechanism-paper gate failed and activated the</w:t>
-      </w:r>
-      <w:r>
-        <w:t xml:space="preserve"> </w:t>
-      </w:r>
-      <w:r>
-        <w:t xml:space="preserve">empirical-study fallback. M3-full passed the security-effect and deny-all</w:t>
-      </w:r>
-      <w:r>
-        <w:t xml:space="preserve"> </w:t>
-      </w:r>
-      <w:r>
-        <w:t xml:space="preserve">checks, but failed the utility point non-inferiority check and showed no</w:t>
-      </w:r>
-      <w:r>
-        <w:t xml:space="preserve"> </w:t>
-      </w:r>
-      <w:r>
-        <w:t xml:space="preserve">security gain over M3 policy-only. These negative gates are retained rather</w:t>
-      </w:r>
-      <w:r>
-        <w:t xml:space="preserve"> </w:t>
-      </w:r>
-      <w:r>
-        <w:t xml:space="preserve">than removed or redefined.</w:t>
+        <w:t xml:space="preserve">probe records. The preregistered analysis did not support an incremental</w:t>
+      </w:r>
+      <w:r>
+        <w:t xml:space="preserve"> </w:t>
+      </w:r>
+      <w:r>
+        <w:t xml:space="preserve">mechanism claim. M3-full met the security-effect and deny-all criteria, but</w:t>
+      </w:r>
+      <w:r>
+        <w:t xml:space="preserve"> </w:t>
+      </w:r>
+      <w:r>
+        <w:t xml:space="preserve">missed the utility point non-inferiority criterion and showed no security gain</w:t>
+      </w:r>
+      <w:r>
+        <w:t xml:space="preserve"> </w:t>
+      </w:r>
+      <w:r>
+        <w:t xml:space="preserve">over M3 policy-only. Both the favorable security comparison and the</w:t>
+      </w:r>
+      <w:r>
+        <w:t xml:space="preserve"> </w:t>
+      </w:r>
+      <w:r>
+        <w:t xml:space="preserve">unfavorable utility and module comparisons are reported.</w:t>
       </w:r>
     </w:p>
     <w:bookmarkStart w:id="48" w:name="Xce66d77d9cae9642b55d5a17ef25ebb445c8776"/>
@@ -6022,25 +6028,25 @@
         <w:pStyle w:val="BodyText"/>
       </w:pPr>
       <w:r>
-        <w:t xml:space="preserve">The medium sample therefore shows a security–utility trade-off, not a</w:t>
-      </w:r>
-      <w:r>
-        <w:t xml:space="preserve"> </w:t>
-      </w:r>
-      <w:r>
-        <w:t xml:space="preserve">mechanism-paper victory. Both M3 variants eliminated the eight unsafe effects</w:t>
-      </w:r>
-      <w:r>
-        <w:t xml:space="preserve"> </w:t>
-      </w:r>
-      <w:r>
-        <w:t xml:space="preserve">observed under the structural condition, but they also completed substantially</w:t>
-      </w:r>
-      <w:r>
-        <w:t xml:space="preserve"> </w:t>
-      </w:r>
-      <w:r>
-        <w:t xml:space="preserve">fewer benign tool tasks.</w:t>
+        <w:t xml:space="preserve">The medium sample therefore shows a security–utility trade-off, not an</w:t>
+      </w:r>
+      <w:r>
+        <w:t xml:space="preserve"> </w:t>
+      </w:r>
+      <w:r>
+        <w:t xml:space="preserve">incremental mechanism benefit. Both M3 variants eliminated the eight unsafe</w:t>
+      </w:r>
+      <w:r>
+        <w:t xml:space="preserve"> </w:t>
+      </w:r>
+      <w:r>
+        <w:t xml:space="preserve">effects observed under the structural condition, but they also completed</w:t>
+      </w:r>
+      <w:r>
+        <w:t xml:space="preserve"> </w:t>
+      </w:r>
+      <w:r>
+        <w:t xml:space="preserve">substantially fewer benign tool tasks.</w:t>
       </w:r>
     </w:p>
     <w:bookmarkEnd w:id="49"/>
@@ -8154,7 +8160,7 @@
         <w:t xml:space="preserve"> </w:t>
       </w:r>
       <w:r>
-        <w:t xml:space="preserve">prospectively frozen operational-quality envelope. Every terminal state remains</w:t>
+        <w:t xml:space="preserve">predefined operational-quality envelope. Every terminal state remains</w:t>
       </w:r>
       <w:r>
         <w:t xml:space="preserve"> </w:t>
@@ -8333,14 +8339,14 @@
       </w:r>
     </w:p>
     <w:bookmarkEnd w:id="53"/>
-    <w:bookmarkStart w:id="54" w:name="mechanismredirect-decision"/>
+    <w:bookmarkStart w:id="54" w:name="prespecified-decision-criteria"/>
     <w:p>
       <w:pPr>
         <w:pStyle w:val="Heading3"/>
         <w:keepNext/>
       </w:pPr>
       <w:r>
-        <w:t xml:space="preserve">4.3 Mechanism/redirect decision</w:t>
+        <w:t xml:space="preserve">4.3 Prespecified decision criteria</w:t>
       </w:r>
     </w:p>
     <w:tbl>
@@ -8360,9 +8366,9 @@
         <w:tblInd w:w="120" w:type="dxa"/>
       </w:tblPr>
       <w:tblGrid>
-        <w:gridCol w:w="3365"/>
-        <w:gridCol w:w="2477"/>
-        <w:gridCol w:w="3518"/>
+        <w:gridCol w:w="3074"/>
+        <w:gridCol w:w="2738"/>
+        <w:gridCol w:w="3548"/>
       </w:tblGrid>
       <w:tr>
         <w:trPr>
@@ -8377,7 +8383,7 @@
               <w:start w:w="120" w:type="dxa"/>
               <w:end w:w="120" w:type="dxa"/>
             </w:tcMar>
-            <w:tcW w:w="3365" w:type="dxa"/>
+            <w:tcW w:w="3074" w:type="dxa"/>
             <w:shd w:fill="E8EEF5"/>
           </w:tcPr>
           <w:p>
@@ -8405,7 +8411,7 @@
               <w:start w:w="120" w:type="dxa"/>
               <w:end w:w="120" w:type="dxa"/>
             </w:tcMar>
-            <w:tcW w:w="2477" w:type="dxa"/>
+            <w:tcW w:w="2738" w:type="dxa"/>
             <w:shd w:fill="E8EEF5"/>
           </w:tcPr>
           <w:p>
@@ -8433,7 +8439,7 @@
               <w:start w:w="120" w:type="dxa"/>
               <w:end w:w="120" w:type="dxa"/>
             </w:tcMar>
-            <w:tcW w:w="3518" w:type="dxa"/>
+            <w:tcW w:w="3548" w:type="dxa"/>
             <w:shd w:fill="E8EEF5"/>
           </w:tcPr>
           <w:p>
@@ -8463,7 +8469,7 @@
               <w:start w:w="120" w:type="dxa"/>
               <w:end w:w="120" w:type="dxa"/>
             </w:tcMar>
-            <w:tcW w:w="3365" w:type="dxa"/>
+            <w:tcW w:w="3074" w:type="dxa"/>
           </w:tcPr>
           <w:p>
             <w:pPr>
@@ -8489,7 +8495,7 @@
               <w:start w:w="120" w:type="dxa"/>
               <w:end w:w="120" w:type="dxa"/>
             </w:tcMar>
-            <w:tcW w:w="2477" w:type="dxa"/>
+            <w:tcW w:w="2738" w:type="dxa"/>
           </w:tcPr>
           <w:p>
             <w:pPr>
@@ -8515,7 +8521,7 @@
               <w:start w:w="120" w:type="dxa"/>
               <w:end w:w="120" w:type="dxa"/>
             </w:tcMar>
-            <w:tcW w:w="3518" w:type="dxa"/>
+            <w:tcW w:w="3548" w:type="dxa"/>
           </w:tcPr>
           <w:p>
             <w:pPr>
@@ -8543,7 +8549,7 @@
               <w:start w:w="120" w:type="dxa"/>
               <w:end w:w="120" w:type="dxa"/>
             </w:tcMar>
-            <w:tcW w:w="3365" w:type="dxa"/>
+            <w:tcW w:w="3074" w:type="dxa"/>
           </w:tcPr>
           <w:p>
             <w:pPr>
@@ -8569,7 +8575,7 @@
               <w:start w:w="120" w:type="dxa"/>
               <w:end w:w="120" w:type="dxa"/>
             </w:tcMar>
-            <w:tcW w:w="2477" w:type="dxa"/>
+            <w:tcW w:w="2738" w:type="dxa"/>
           </w:tcPr>
           <w:p>
             <w:pPr>
@@ -8595,7 +8601,7 @@
               <w:start w:w="120" w:type="dxa"/>
               <w:end w:w="120" w:type="dxa"/>
             </w:tcMar>
-            <w:tcW w:w="3518" w:type="dxa"/>
+            <w:tcW w:w="3548" w:type="dxa"/>
           </w:tcPr>
           <w:p>
             <w:pPr>
@@ -8623,7 +8629,7 @@
               <w:start w:w="120" w:type="dxa"/>
               <w:end w:w="120" w:type="dxa"/>
             </w:tcMar>
-            <w:tcW w:w="3365" w:type="dxa"/>
+            <w:tcW w:w="3074" w:type="dxa"/>
           </w:tcPr>
           <w:p>
             <w:pPr>
@@ -8649,7 +8655,7 @@
               <w:start w:w="120" w:type="dxa"/>
               <w:end w:w="120" w:type="dxa"/>
             </w:tcMar>
-            <w:tcW w:w="2477" w:type="dxa"/>
+            <w:tcW w:w="2738" w:type="dxa"/>
           </w:tcPr>
           <w:p>
             <w:pPr>
@@ -8675,7 +8681,7 @@
               <w:start w:w="120" w:type="dxa"/>
               <w:end w:w="120" w:type="dxa"/>
             </w:tcMar>
-            <w:tcW w:w="3518" w:type="dxa"/>
+            <w:tcW w:w="3548" w:type="dxa"/>
           </w:tcPr>
           <w:p>
             <w:pPr>
@@ -8703,7 +8709,7 @@
               <w:start w:w="120" w:type="dxa"/>
               <w:end w:w="120" w:type="dxa"/>
             </w:tcMar>
-            <w:tcW w:w="3365" w:type="dxa"/>
+            <w:tcW w:w="3074" w:type="dxa"/>
           </w:tcPr>
           <w:p>
             <w:pPr>
@@ -8729,7 +8735,7 @@
               <w:start w:w="120" w:type="dxa"/>
               <w:end w:w="120" w:type="dxa"/>
             </w:tcMar>
-            <w:tcW w:w="2477" w:type="dxa"/>
+            <w:tcW w:w="2738" w:type="dxa"/>
           </w:tcPr>
           <w:p>
             <w:pPr>
@@ -8755,7 +8761,7 @@
               <w:start w:w="120" w:type="dxa"/>
               <w:end w:w="120" w:type="dxa"/>
             </w:tcMar>
-            <w:tcW w:w="3518" w:type="dxa"/>
+            <w:tcW w:w="3548" w:type="dxa"/>
           </w:tcPr>
           <w:p>
             <w:pPr>
@@ -8783,7 +8789,7 @@
               <w:start w:w="120" w:type="dxa"/>
               <w:end w:w="120" w:type="dxa"/>
             </w:tcMar>
-            <w:tcW w:w="3365" w:type="dxa"/>
+            <w:tcW w:w="3074" w:type="dxa"/>
           </w:tcPr>
           <w:p>
             <w:pPr>
@@ -8809,7 +8815,7 @@
               <w:start w:w="120" w:type="dxa"/>
               <w:end w:w="120" w:type="dxa"/>
             </w:tcMar>
-            <w:tcW w:w="2477" w:type="dxa"/>
+            <w:tcW w:w="2738" w:type="dxa"/>
           </w:tcPr>
           <w:p>
             <w:pPr>
@@ -8835,7 +8841,7 @@
               <w:start w:w="120" w:type="dxa"/>
               <w:end w:w="120" w:type="dxa"/>
             </w:tcMar>
-            <w:tcW w:w="3518" w:type="dxa"/>
+            <w:tcW w:w="3548" w:type="dxa"/>
           </w:tcPr>
           <w:p>
             <w:pPr>
@@ -8848,7 +8854,7 @@
                 <w:rFonts w:ascii="Times New Roman" w:hAnsi="Times New Roman"/>
                 <w:sz w:val="17"/>
               </w:rPr>
-              <w:t xml:space="preserve">All three frozen quality checks passed</w:t>
+              <w:t xml:space="preserve">All three predefined quality checks passed</w:t>
             </w:r>
           </w:p>
         </w:tc>
@@ -8863,7 +8869,7 @@
               <w:start w:w="120" w:type="dxa"/>
               <w:end w:w="120" w:type="dxa"/>
             </w:tcMar>
-            <w:tcW w:w="3365" w:type="dxa"/>
+            <w:tcW w:w="3074" w:type="dxa"/>
           </w:tcPr>
           <w:p>
             <w:pPr>
@@ -8876,20 +8882,20 @@
                 <w:rFonts w:ascii="Times New Roman" w:hAnsi="Times New Roman"/>
                 <w:sz w:val="17"/>
               </w:rPr>
-              <w:t xml:space="preserve">Paper route</w:t>
-            </w:r>
-          </w:p>
-        </w:tc>
-        <w:tc>
-          <w:tcPr>
-            <w:vAlign w:val="center"/>
-            <w:tcMar>
-              <w:top w:w="80" w:type="dxa"/>
-              <w:bottom w:w="80" w:type="dxa"/>
-              <w:start w:w="120" w:type="dxa"/>
-              <w:end w:w="120" w:type="dxa"/>
-            </w:tcMar>
-            <w:tcW w:w="2477" w:type="dxa"/>
+              <w:t xml:space="preserve">Supported interpretation</w:t>
+            </w:r>
+          </w:p>
+        </w:tc>
+        <w:tc>
+          <w:tcPr>
+            <w:vAlign w:val="center"/>
+            <w:tcMar>
+              <w:top w:w="80" w:type="dxa"/>
+              <w:bottom w:w="80" w:type="dxa"/>
+              <w:start w:w="120" w:type="dxa"/>
+              <w:end w:w="120" w:type="dxa"/>
+            </w:tcMar>
+            <w:tcW w:w="2738" w:type="dxa"/>
           </w:tcPr>
           <w:p>
             <w:pPr>
@@ -8902,20 +8908,20 @@
                 <w:rFonts w:ascii="Times New Roman" w:hAnsi="Times New Roman"/>
                 <w:sz w:val="17"/>
               </w:rPr>
-              <w:t xml:space="preserve">Empirical study</w:t>
-            </w:r>
-          </w:p>
-        </w:tc>
-        <w:tc>
-          <w:tcPr>
-            <w:vAlign w:val="center"/>
-            <w:tcMar>
-              <w:top w:w="80" w:type="dxa"/>
-              <w:bottom w:w="80" w:type="dxa"/>
-              <w:start w:w="120" w:type="dxa"/>
-              <w:end w:w="120" w:type="dxa"/>
-            </w:tcMar>
-            <w:tcW w:w="3518" w:type="dxa"/>
+              <w:t xml:space="preserve">Empirical trade-off study</w:t>
+            </w:r>
+          </w:p>
+        </w:tc>
+        <w:tc>
+          <w:tcPr>
+            <w:vAlign w:val="center"/>
+            <w:tcMar>
+              <w:top w:w="80" w:type="dxa"/>
+              <w:bottom w:w="80" w:type="dxa"/>
+              <w:start w:w="120" w:type="dxa"/>
+              <w:end w:w="120" w:type="dxa"/>
+            </w:tcMar>
+            <w:tcW w:w="3548" w:type="dxa"/>
           </w:tcPr>
           <w:p>
             <w:pPr>
@@ -8928,7 +8934,7 @@
                 <w:rFonts w:ascii="Times New Roman" w:hAnsi="Times New Roman"/>
                 <w:sz w:val="17"/>
               </w:rPr>
-              <w:t xml:space="preserve">Defense-mechanism route not supported</w:t>
+              <w:t xml:space="preserve">Incremental defense-mechanism claim not supported</w:t>
             </w:r>
           </w:p>
         </w:tc>
@@ -8939,19 +8945,19 @@
         <w:pStyle w:val="BodyText"/>
       </w:pPr>
       <w:r>
-        <w:t xml:space="preserve">The active manuscript route is therefore an empirical study of authorization</w:t>
-      </w:r>
-      <w:r>
-        <w:t xml:space="preserve"> </w:t>
-      </w:r>
-      <w:r>
-        <w:t xml:space="preserve">uncertainty and the security–utility trade-off. A defense-mechanism or SOTA</w:t>
-      </w:r>
-      <w:r>
-        <w:t xml:space="preserve"> </w:t>
-      </w:r>
-      <w:r>
-        <w:t xml:space="preserve">claim is prohibited.</w:t>
+        <w:t xml:space="preserve">The results therefore support an empirical study of authorization uncertainty</w:t>
+      </w:r>
+      <w:r>
+        <w:t xml:space="preserve"> </w:t>
+      </w:r>
+      <w:r>
+        <w:t xml:space="preserve">and the security–utility trade-off. They do not support a defense-superiority</w:t>
+      </w:r>
+      <w:r>
+        <w:t xml:space="preserve"> </w:t>
+      </w:r>
+      <w:r>
+        <w:t xml:space="preserve">or SOTA claim.</w:t>
       </w:r>
     </w:p>
     <w:bookmarkEnd w:id="54"/>
@@ -8982,7 +8988,7 @@
         <w:t xml:space="preserve"> </w:t>
       </w:r>
       <w:r>
-        <w:t xml:space="preserve">diagnostic records (1.4955%) remain in ITT. The frozen 1% quality ceiling</w:t>
+        <w:t xml:space="preserve">diagnostic records (1.4955%) remain in ITT. The predefined 1% quality ceiling</w:t>
       </w:r>
       <w:r>
         <w:t xml:space="preserve"> </w:t>
@@ -10056,19 +10062,25 @@
         <w:t xml:space="preserve"> </w:t>
       </w:r>
       <w:r>
-        <w:t xml:space="preserve">mechanism gate therefore passed its structural security-effect check but</w:t>
-      </w:r>
-      <w:r>
-        <w:t xml:space="preserve"> </w:t>
-      </w:r>
-      <w:r>
-        <w:t xml:space="preserve">failed utility non-inferiority and module gain. The active route remains the</w:t>
-      </w:r>
-      <w:r>
-        <w:t xml:space="preserve"> </w:t>
-      </w:r>
-      <w:r>
-        <w:t xml:space="preserve">empirical security–utility fallback.</w:t>
+        <w:t xml:space="preserve">mechanism comparison therefore met its structural security-effect criterion</w:t>
+      </w:r>
+      <w:r>
+        <w:t xml:space="preserve"> </w:t>
+      </w:r>
+      <w:r>
+        <w:t xml:space="preserve">but missed utility non-inferiority and module-gain criteria. This pattern is</w:t>
+      </w:r>
+      <w:r>
+        <w:t xml:space="preserve"> </w:t>
+      </w:r>
+      <w:r>
+        <w:t xml:space="preserve">consistent with a security–utility trade-off rather than incremental benefit</w:t>
+      </w:r>
+      <w:r>
+        <w:t xml:space="preserve"> </w:t>
+      </w:r>
+      <w:r>
+        <w:t xml:space="preserve">from the full mechanism.</w:t>
       </w:r>
     </w:p>
     <w:bookmarkEnd w:id="58"/>
@@ -10611,7 +10623,7 @@
         <w:pStyle w:val="FirstParagraph"/>
       </w:pPr>
       <w:r>
-        <w:t xml:space="preserve">The completed DeepSeek V4 Pro cost canary covered eight result-blind,</w:t>
+        <w:t xml:space="preserve">The initial DeepSeek V4 Pro cost canary covered eight result-blind,</w:t>
       </w:r>
       <w:r>
         <w:t xml:space="preserve"> </w:t>
@@ -11957,7 +11969,7 @@
         <w:pStyle w:val="BodyText"/>
       </w:pPr>
       <w:r>
-        <w:t xml:space="preserve">The Public evidence already illustrates the problem. Relative to the completed</w:t>
+        <w:t xml:space="preserve">The Public evidence already illustrates the problem. Relative to the</w:t>
       </w:r>
       <w:r>
         <w:t xml:space="preserve"> </w:t>
@@ -12499,19 +12511,19 @@
         <w:pStyle w:val="FirstParagraph"/>
       </w:pPr>
       <w:r>
-        <w:t xml:space="preserve">Three practical recommendations follow even before the new paired estimates</w:t>
-      </w:r>
-      <w:r>
-        <w:t xml:space="preserve"> </w:t>
-      </w:r>
-      <w:r>
-        <w:t xml:space="preserve">are filled. First, agent-security benchmarks should publish the fields visible</w:t>
-      </w:r>
-      <w:r>
-        <w:t xml:space="preserve"> </w:t>
-      </w:r>
-      <w:r>
-        <w:t xml:space="preserve">to the online Guard and keep evaluator-only answers outside that projection.</w:t>
+        <w:t xml:space="preserve">Three practical recommendations follow. First, agent-security benchmarks</w:t>
+      </w:r>
+      <w:r>
+        <w:t xml:space="preserve"> </w:t>
+      </w:r>
+      <w:r>
+        <w:t xml:space="preserve">should publish the fields visible to the online Guard and keep evaluator-only</w:t>
+      </w:r>
+      <w:r>
+        <w:t xml:space="preserve"> </w:t>
+      </w:r>
+      <w:r>
+        <w:t xml:space="preserve">answers outside that projection.</w:t>
       </w:r>
       <w:r>
         <w:t xml:space="preserve"> </w:t>

</xml_diff>

<commit_message>
docs: tighten cross-provider claim boundary
</commit_message>
<xml_diff>
--- a/docs/research/paper_v2/manuscript/M3_PI_Guard_JISA_working_draft.docx
+++ b/docs/research/paper_v2/manuscript/M3_PI_Guard_JISA_working_draft.docx
@@ -12338,13 +12338,19 @@
         <w:t xml:space="preserve"> </w:t>
       </w:r>
       <w:r>
-        <w:t xml:space="preserve">may change the effects. The smaller Gemini subset partially probes but does not</w:t>
-      </w:r>
-      <w:r>
-        <w:t xml:space="preserve"> </w:t>
-      </w:r>
-      <w:r>
-        <w:t xml:space="preserve">eliminate this dependence.</w:t>
+        <w:t xml:space="preserve">may change the effects. The smaller Gemini subset was designed to probe this</w:t>
+      </w:r>
+      <w:r>
+        <w:t xml:space="preserve"> </w:t>
+      </w:r>
+      <w:r>
+        <w:t xml:space="preserve">dependence, but it contributes no cross-provider evidence unless all 450 work</w:t>
+      </w:r>
+      <w:r>
+        <w:t xml:space="preserve"> </w:t>
+      </w:r>
+      <w:r>
+        <w:t xml:space="preserve">items reach terminal status.</w:t>
       </w:r>
     </w:p>
     <w:p>
@@ -12579,19 +12585,19 @@
         <w:t xml:space="preserve"> </w:t>
       </w:r>
       <w:r>
-        <w:t xml:space="preserve">zero. Gemini will determine whether the direction is visible across providers;</w:t>
-      </w:r>
-      <w:r>
-        <w:t xml:space="preserve"> </w:t>
-      </w:r>
-      <w:r>
-        <w:t xml:space="preserve">it cannot remove the unfavorable DeepSeek findings or broaden them beyond the</w:t>
-      </w:r>
-      <w:r>
-        <w:t xml:space="preserve"> </w:t>
-      </w:r>
-      <w:r>
-        <w:t xml:space="preserve">tested settings.</w:t>
+        <w:t xml:space="preserve">zero. The prespecified Gemini stopping rule determines whether a complete</w:t>
+      </w:r>
+      <w:r>
+        <w:t xml:space="preserve"> </w:t>
+      </w:r>
+      <w:r>
+        <w:t xml:space="preserve">cross-provider comparison is available; an incomplete subset remains</w:t>
+      </w:r>
+      <w:r>
+        <w:t xml:space="preserve"> </w:t>
+      </w:r>
+      <w:r>
+        <w:t xml:space="preserve">diagnostic and cannot alter or broaden the DeepSeek findings.</w:t>
       </w:r>
     </w:p>
     <w:bookmarkEnd w:id="73"/>

</xml_diff>

<commit_message>
docs: complete empirical devil review
</commit_message>
<xml_diff>
--- a/docs/research/paper_v2/manuscript/M3_PI_Guard_JISA_working_draft.docx
+++ b/docs/research/paper_v2/manuscript/M3_PI_Guard_JISA_working_draft.docx
@@ -12358,7 +12358,45 @@
         <w:pStyle w:val="BodyText"/>
       </w:pPr>
       <w:r>
-        <w:t xml:space="preserve">Second,</w:t>
+        <w:t xml:space="preserve">Second, the new authorization experiment has a strong attack-endpoint floor:</w:t>
+      </w:r>
+      <w:r>
+        <w:t xml:space="preserve"> </w:t>
+      </w:r>
+      <w:r>
+        <w:t xml:space="preserve">only one unsafe effect occurred across the 400 primary attack records. It can</w:t>
+      </w:r>
+      <w:r>
+        <w:t xml:space="preserve"> </w:t>
+      </w:r>
+      <w:r>
+        <w:t xml:space="preserve">therefore estimate utility and operational burden more informatively than</w:t>
+      </w:r>
+      <w:r>
+        <w:t xml:space="preserve"> </w:t>
+      </w:r>
+      <w:r>
+        <w:t xml:space="preserve">small security differences between its four primary cells. Security-direction</w:t>
+      </w:r>
+      <w:r>
+        <w:t xml:space="preserve"> </w:t>
+      </w:r>
+      <w:r>
+        <w:t xml:space="preserve">evidence comes mainly from the larger Public matrices and must not be inferred</w:t>
+      </w:r>
+      <w:r>
+        <w:t xml:space="preserve"> </w:t>
+      </w:r>
+      <w:r>
+        <w:t xml:space="preserve">from these near-zero cells alone.</w:t>
+      </w:r>
+    </w:p>
+    <w:p>
+      <w:pPr>
+        <w:pStyle w:val="BodyText"/>
+      </w:pPr>
+      <w:r>
+        <w:t xml:space="preserve">Third,</w:t>
       </w:r>
       <w:r>
         <w:t xml:space="preserve"> </w:t>
@@ -12414,7 +12452,7 @@
         <w:pStyle w:val="BodyText"/>
       </w:pPr>
       <w:r>
-        <w:t xml:space="preserve">Third, the effect environment is isolated. This is necessary to prevent real</w:t>
+        <w:t xml:space="preserve">Fourth, the effect environment is isolated. This is necessary to prevent real</w:t>
       </w:r>
       <w:r>
         <w:t xml:space="preserve"> </w:t>
@@ -12434,7 +12472,7 @@
         <w:pStyle w:val="BodyText"/>
       </w:pPr>
       <w:r>
-        <w:t xml:space="preserve">Fourth, the adaptive panel reports budgets only through 200 and does not prove</w:t>
+        <w:t xml:space="preserve">Fifth, the adaptive panel reports budgets only through 200 and does not prove</w:t>
       </w:r>
       <w:r>
         <w:t xml:space="preserve"> </w:t>
@@ -12454,7 +12492,7 @@
         <w:pStyle w:val="BodyText"/>
       </w:pPr>
       <w:r>
-        <w:t xml:space="preserve">Fifth, failure handling is conservative but not interpretation-free. All</w:t>
+        <w:t xml:space="preserve">Sixth, failure handling is conservative but not interpretation-free. All</w:t>
       </w:r>
       <w:r>
         <w:t xml:space="preserve"> </w:t>

</xml_diff>

<commit_message>
docs: complete empirical method review
</commit_message>
<xml_diff>
--- a/docs/research/paper_v2/manuscript/M3_PI_Guard_JISA_working_draft.docx
+++ b/docs/research/paper_v2/manuscript/M3_PI_Guard_JISA_working_draft.docx
@@ -3833,7 +3833,31 @@
         <w:t xml:space="preserve"> </w:t>
       </w:r>
       <w:r>
-        <w:t xml:space="preserve">successful security outcome.</w:t>
+        <w:t xml:space="preserve">successful security outcome. Its unsafe-effect indicator records whether an</w:t>
+      </w:r>
+      <w:r>
+        <w:t xml:space="preserve"> </w:t>
+      </w:r>
+      <w:r>
+        <w:t xml:space="preserve">isolated unsafe effect was observed, while its operational failure remains a</w:t>
+      </w:r>
+      <w:r>
+        <w:t xml:space="preserve"> </w:t>
+      </w:r>
+      <w:r>
+        <w:t xml:space="preserve">separate reported outcome and it cannot count as task completion. Latency and</w:t>
+      </w:r>
+      <w:r>
+        <w:t xml:space="preserve"> </w:t>
+      </w:r>
+      <w:r>
+        <w:t xml:space="preserve">burden summaries likewise include all terminal work items, not only completed</w:t>
+      </w:r>
+      <w:r>
+        <w:t xml:space="preserve"> </w:t>
+      </w:r>
+      <w:r>
+        <w:t xml:space="preserve">ones.</w:t>
       </w:r>
     </w:p>
     <w:bookmarkEnd w:id="44"/>
@@ -3876,7 +3900,19 @@
         <w:t xml:space="preserve"> </w:t>
       </w:r>
       <w:r>
-        <w:t xml:space="preserve">resamples clustered by task.</w:t>
+        <w:t xml:space="preserve">resamples. Each resample draws paired case identifiers with replacement and</w:t>
+      </w:r>
+      <w:r>
+        <w:t xml:space="preserve"> </w:t>
+      </w:r>
+      <w:r>
+        <w:t xml:space="preserve">keeps both condition outcomes for the selected case together; the case is the</w:t>
+      </w:r>
+      <w:r>
+        <w:t xml:space="preserve"> </w:t>
+      </w:r>
+      <w:r>
+        <w:t xml:space="preserve">cluster and inferential unit.</w:t>
       </w:r>
     </w:p>
     <w:p>

</xml_diff>

<commit_message>
fix: align Gemini partial terminal state
</commit_message>
<xml_diff>
--- a/docs/research/paper_v2/manuscript/M3_PI_Guard_JISA_working_draft.docx
+++ b/docs/research/paper_v2/manuscript/M3_PI_Guard_JISA_working_draft.docx
@@ -3694,13 +3694,25 @@
         <w:t xml:space="preserve"> </w:t>
       </w:r>
       <w:r>
-        <w:t xml:space="preserve">item and</w:t>
-      </w:r>
-      <w:r>
-        <w:t xml:space="preserve"> </w:t>
-      </w:r>
-      <w:r>
-        <w:t xml:space="preserve">reports the count of superseded attempts. No prior row is overwritten.</w:t>
+        <w:t xml:space="preserve">item and reports the count of superseded attempts. For Gemini, it applies the</w:t>
+      </w:r>
+      <w:r>
+        <w:t xml:space="preserve"> </w:t>
+      </w:r>
+      <w:r>
+        <w:t xml:space="preserve">same retry-state normalization as the runner using the content-free pause-event</w:t>
+      </w:r>
+      <w:r>
+        <w:t xml:space="preserve"> </w:t>
+      </w:r>
+      <w:r>
+        <w:t xml:space="preserve">ledger, so a quota pause cannot be mistaken for a scientific terminal. No prior</w:t>
+      </w:r>
+      <w:r>
+        <w:t xml:space="preserve"> </w:t>
+      </w:r>
+      <w:r>
+        <w:t xml:space="preserve">row is overwritten.</w:t>
       </w:r>
     </w:p>
     <w:bookmarkEnd w:id="43"/>

</xml_diff>

<commit_message>
docs: clarify derived authorization boundary
</commit_message>
<xml_diff>
--- a/docs/research/paper_v2/manuscript/M3_PI_Guard_JISA_working_draft.docx
+++ b/docs/research/paper_v2/manuscript/M3_PI_Guard_JISA_working_draft.docx
@@ -27,31 +27,31 @@
         <w:pStyle w:val="FirstParagraph"/>
       </w:pPr>
       <w:r>
-        <w:t xml:space="preserve">Tool-using large language model agents can turn prompt injection into external</w:t>
-      </w:r>
-      <w:r>
-        <w:t xml:space="preserve"> </w:t>
-      </w:r>
-      <w:r>
-        <w:t xml:space="preserve">actions, but measured security depends on both the runtime mechanism and its</w:t>
-      </w:r>
-      <w:r>
-        <w:t xml:space="preserve"> </w:t>
-      </w:r>
-      <w:r>
-        <w:t xml:space="preserve">authorization information. We use an online-state projection excluding</w:t>
-      </w:r>
-      <w:r>
-        <w:t xml:space="preserve"> </w:t>
-      </w:r>
-      <w:r>
-        <w:t xml:space="preserve">evaluator and gold fields, paired policy-only and provenance-aware enforcement,</w:t>
-      </w:r>
-      <w:r>
-        <w:t xml:space="preserve"> </w:t>
-      </w:r>
-      <w:r>
-        <w:t xml:space="preserve">and joint security, utility, burden, failure, latency, and cost measurements.</w:t>
+        <w:t xml:space="preserve">Tool-using LLM agents can turn prompt injection into external actions, but</w:t>
+      </w:r>
+      <w:r>
+        <w:t xml:space="preserve"> </w:t>
+      </w:r>
+      <w:r>
+        <w:t xml:space="preserve">measured security depends on runtime authorization. We exclude raw evaluator</w:t>
+      </w:r>
+      <w:r>
+        <w:t xml:space="preserve"> </w:t>
+      </w:r>
+      <w:r>
+        <w:t xml:space="preserve">and scoring fields from online state, vary authorization—including an</w:t>
+      </w:r>
+      <w:r>
+        <w:t xml:space="preserve"> </w:t>
+      </w:r>
+      <w:r>
+        <w:t xml:space="preserve">explicitly gold-derived sensitivity condition—and jointly measure unsafe</w:t>
+      </w:r>
+      <w:r>
+        <w:t xml:space="preserve"> </w:t>
+      </w:r>
+      <w:r>
+        <w:t xml:space="preserve">effects, task completion, burden, failure, latency, and cost.</w:t>
       </w:r>
     </w:p>
     <w:p>
@@ -10189,13 +10189,28 @@
         <w:t xml:space="preserve"> </w:t>
       </w:r>
       <w:r>
-        <w:t xml:space="preserve">15 provider failures, and 33 repeated pre-response failures. No evaluator or</w:t>
-      </w:r>
-      <w:r>
-        <w:t xml:space="preserve"> </w:t>
-      </w:r>
-      <w:r>
-        <w:t xml:space="preserve">gold field entered the online projection, and provider tools and real external</w:t>
+        <w:t xml:space="preserve">15 provider failures, and 33 repeated pre-response failures. No raw evaluator,</w:t>
+      </w:r>
+      <w:r>
+        <w:t xml:space="preserve"> </w:t>
+      </w:r>
+      <w:r>
+        <w:t xml:space="preserve">label, or gold-answer field entered the online projection;</w:t>
+      </w:r>
+      <w:r>
+        <w:t xml:space="preserve"> </w:t>
+      </w:r>
+      <w:r>
+        <w:rPr>
+          <w:rStyle w:val="VerbatimChar"/>
+        </w:rPr>
+        <w:t xml:space="preserve">exact_gold</w:t>
+      </w:r>
+      <w:r>
+        <w:t xml:space="preserve"> </w:t>
+      </w:r>
+      <w:r>
+        <w:t xml:space="preserve">exposed only its derived authorization object. Provider tools and real external</w:t>
       </w:r>
       <w:r>
         <w:t xml:space="preserve"> </w:t>
@@ -24244,7 +24259,7 @@
         <w:t xml:space="preserve"> </w:t>
       </w:r>
       <w:r>
-        <w:t xml:space="preserve">the proposed action may enter the runtime Guard. Gold answers, evaluator</w:t>
+        <w:t xml:space="preserve">the proposed action may enter the runtime Guard. Raw gold answers, evaluator</w:t>
       </w:r>
       <w:r>
         <w:t xml:space="preserve"> </w:t>
@@ -24256,13 +24271,34 @@
         <w:t xml:space="preserve"> </w:t>
       </w:r>
       <w:r>
-        <w:t xml:space="preserve">Only isolated simulated effects are scored; provider-managed tools and real</w:t>
-      </w:r>
-      <w:r>
-        <w:t xml:space="preserve"> </w:t>
-      </w:r>
-      <w:r>
-        <w:t xml:space="preserve">external actions are disabled.</w:t>
+        <w:t xml:space="preserve">The</w:t>
+      </w:r>
+      <w:r>
+        <w:t xml:space="preserve"> </w:t>
+      </w:r>
+      <w:r>
+        <w:rPr>
+          <w:rStyle w:val="VerbatimChar"/>
+        </w:rPr>
+        <w:t xml:space="preserve">exact_gold</w:t>
+      </w:r>
+      <w:r>
+        <w:t xml:space="preserve"> </w:t>
+      </w:r>
+      <w:r>
+        <w:t xml:space="preserve">sensitivity condition exposes only a derived authorization</w:t>
+      </w:r>
+      <w:r>
+        <w:t xml:space="preserve"> </w:t>
+      </w:r>
+      <w:r>
+        <w:t xml:space="preserve">object to the policy projection. Only isolated simulated effects are scored;</w:t>
+      </w:r>
+      <w:r>
+        <w:t xml:space="preserve"> </w:t>
+      </w:r>
+      <w:r>
+        <w:t xml:space="preserve">provider-managed tools and real external actions are disabled.</w:t>
       </w:r>
     </w:p>
     <w:p>

</xml_diff>

<commit_message>
docs: disclose provider alias reproducibility
</commit_message>
<xml_diff>
--- a/docs/research/paper_v2/manuscript/M3_PI_Guard_JISA_working_draft.docx
+++ b/docs/research/paper_v2/manuscript/M3_PI_Guard_JISA_working_draft.docx
@@ -3534,6 +3534,24 @@
       </w:r>
       <w:r>
         <w:t xml:space="preserve">returned model identity, usage, latency, and cost or free-tier attestation.</w:t>
+      </w:r>
+      <w:r>
+        <w:t xml:space="preserve"> </w:t>
+      </w:r>
+      <w:r>
+        <w:t xml:space="preserve">Provider calls for the evidence reported here were made during July and August</w:t>
+      </w:r>
+      <w:r>
+        <w:t xml:space="preserve"> </w:t>
+      </w:r>
+      <w:r>
+        <w:t xml:space="preserve">2026. The returned names are provider-managed model aliases and therefore</w:t>
+      </w:r>
+      <w:r>
+        <w:t xml:space="preserve"> </w:t>
+      </w:r>
+      <w:r>
+        <w:t xml:space="preserve">identify the served model at request time without freezing its hidden weights.</w:t>
       </w:r>
     </w:p>
     <w:p>
@@ -12413,7 +12431,19 @@
         <w:t xml:space="preserve"> </w:t>
       </w:r>
       <w:r>
-        <w:t xml:space="preserve">items reach terminal status.</w:t>
+        <w:t xml:space="preserve">items reach terminal status. Although execution dates, official response</w:t>
+      </w:r>
+      <w:r>
+        <w:t xml:space="preserve"> </w:t>
+      </w:r>
+      <w:r>
+        <w:t xml:space="preserve">identifiers, and returned model names are retained, provider-managed aliases do</w:t>
+      </w:r>
+      <w:r>
+        <w:t xml:space="preserve"> </w:t>
+      </w:r>
+      <w:r>
+        <w:t xml:space="preserve">not make the underlying weights immutable.</w:t>
       </w:r>
     </w:p>
     <w:p>

</xml_diff>

<commit_message>
docs: complete AI-use disclosure
</commit_message>
<xml_diff>
--- a/docs/research/paper_v2/manuscript/M3_PI_Guard_JISA_working_draft.docx
+++ b/docs/research/paper_v2/manuscript/M3_PI_Guard_JISA_working_draft.docx
@@ -24666,25 +24666,37 @@
         <w:t xml:space="preserve"> </w:t>
       </w:r>
       <w:r>
-        <w:t xml:space="preserve">revision. The authors reviewed and revised the resulting material and take</w:t>
-      </w:r>
-      <w:r>
-        <w:t xml:space="preserve"> </w:t>
-      </w:r>
-      <w:r>
-        <w:t xml:space="preserve">full responsibility for the analysis, interpretation, citations, and</w:t>
-      </w:r>
-      <w:r>
-        <w:t xml:space="preserve"> </w:t>
-      </w:r>
-      <w:r>
-        <w:t xml:space="preserve">manuscript content. DeepSeek and Gemini are evaluated research systems in this</w:t>
-      </w:r>
-      <w:r>
-        <w:t xml:space="preserve"> </w:t>
-      </w:r>
-      <w:r>
-        <w:t xml:space="preserve">study rather than writing assistants.</w:t>
+        <w:t xml:space="preserve">revision. An earlier DeepSeek-generated project-planning note supplied by the</w:t>
+      </w:r>
+      <w:r>
+        <w:t xml:space="preserve"> </w:t>
+      </w:r>
+      <w:r>
+        <w:t xml:space="preserve">project owner was consulted during study scoping. The authors reviewed and</w:t>
+      </w:r>
+      <w:r>
+        <w:t xml:space="preserve"> </w:t>
+      </w:r>
+      <w:r>
+        <w:t xml:space="preserve">revised the resulting material and take full responsibility for the analysis,</w:t>
+      </w:r>
+      <w:r>
+        <w:t xml:space="preserve"> </w:t>
+      </w:r>
+      <w:r>
+        <w:t xml:space="preserve">interpretation, citations, and manuscript content. DeepSeek and Gemini API</w:t>
+      </w:r>
+      <w:r>
+        <w:t xml:space="preserve"> </w:t>
+      </w:r>
+      <w:r>
+        <w:t xml:space="preserve">outputs reported in the experiments are evaluated research data; they were not</w:t>
+      </w:r>
+      <w:r>
+        <w:t xml:space="preserve"> </w:t>
+      </w:r>
+      <w:r>
+        <w:t xml:space="preserve">used to generate outcome labels or statistical conclusions.</w:t>
       </w:r>
     </w:p>
     <w:bookmarkEnd w:id="93"/>

</xml_diff>

<commit_message>
docs: align JISA submission requirements
</commit_message>
<xml_diff>
--- a/docs/research/paper_v2/manuscript/M3_PI_Guard_JISA_working_draft.docx
+++ b/docs/research/paper_v2/manuscript/M3_PI_Guard_JISA_working_draft.docx
@@ -19541,14 +19541,14 @@
       </w:r>
     </w:p>
     <w:bookmarkEnd w:id="86"/>
-    <w:bookmarkStart w:id="87" w:name="X071796dd6bc546c91e96cca1cf5ff96599de61f"/>
+    <w:bookmarkStart w:id="87" w:name="X1f74eb43af444059c7518034463b6c89b1cacf4"/>
     <w:p>
       <w:pPr>
         <w:pStyle w:val="Heading3"/>
         <w:keepNext/>
       </w:pPr>
       <w:r>
-        <w:t xml:space="preserve">Declaration of generative AI and AI-assisted technologies in the writing process</w:t>
+        <w:t xml:space="preserve">Declaration of generative AI and AI-assisted technologies in the manuscript preparation process</w:t>
       </w:r>
     </w:p>
     <w:p>

</xml_diff>

<commit_message>
docs: polish supplementary table references
</commit_message>
<xml_diff>
--- a/docs/research/paper_v2/manuscript/M3_PI_Guard_JISA_working_draft.docx
+++ b/docs/research/paper_v2/manuscript/M3_PI_Guard_JISA_working_draft.docx
@@ -4248,19 +4248,19 @@
         <w:t xml:space="preserve"> </w:t>
       </w:r>
       <w:r>
-        <w:t xml:space="preserve">as editable SVG plus raster QA previews. Reproducibility assets include frozen</w:t>
-      </w:r>
-      <w:r>
-        <w:t xml:space="preserve"> </w:t>
-      </w:r>
-      <w:r>
-        <w:t xml:space="preserve">samples, condition assignments, analysis code, aggregate tables, and versioned</w:t>
-      </w:r>
-      <w:r>
-        <w:t xml:space="preserve"> </w:t>
-      </w:r>
-      <w:r>
-        <w:t xml:space="preserve">source.</w:t>
+        <w:t xml:space="preserve">as submission-ready vector PDF, editable SVG, and raster PNG previews for</w:t>
+      </w:r>
+      <w:r>
+        <w:t xml:space="preserve"> </w:t>
+      </w:r>
+      <w:r>
+        <w:t xml:space="preserve">manuscript/QA use. Reproducibility assets include frozen samples, condition</w:t>
+      </w:r>
+      <w:r>
+        <w:t xml:space="preserve"> </w:t>
+      </w:r>
+      <w:r>
+        <w:t xml:space="preserve">assignments, analysis code, aggregate tables, and versioned source.</w:t>
       </w:r>
     </w:p>
     <w:bookmarkEnd w:id="46"/>
@@ -4349,7 +4349,7 @@
         <w:pStyle w:val="BodyText"/>
       </w:pPr>
       <w:r>
-        <w:t xml:space="preserve">Detailed values are reported in Supplementary Table S1.</w:t>
+        <w:t xml:space="preserve">Supplementary Table S1 reports the online-state source audit.</w:t>
       </w:r>
     </w:p>
     <w:p>
@@ -4371,7 +4371,7 @@
         <w:pStyle w:val="BodyText"/>
       </w:pPr>
       <w:r>
-        <w:t xml:space="preserve">Detailed values are reported in Supplementary Table S2.</w:t>
+        <w:t xml:space="preserve">Supplementary Table S2 reports the completed medium security and utility outcomes.</w:t>
       </w:r>
     </w:p>
     <w:p>
@@ -4405,7 +4405,7 @@
         <w:pStyle w:val="BodyText"/>
       </w:pPr>
       <w:r>
-        <w:t xml:space="preserve">Detailed values are reported in Supplementary Table S3.</w:t>
+        <w:t xml:space="preserve">Supplementary Table S3 reports the prespecified paired comparisons.</w:t>
       </w:r>
     </w:p>
     <w:p>
@@ -4439,7 +4439,7 @@
         <w:pStyle w:val="BodyText"/>
       </w:pPr>
       <w:r>
-        <w:t xml:space="preserve">Detailed values are reported in Supplementary Table S4.</w:t>
+        <w:t xml:space="preserve">Supplementary Table S4 reports the runtime burden and operational quality.</w:t>
       </w:r>
     </w:p>
     <w:p>
@@ -5412,7 +5412,7 @@
         <w:pStyle w:val="BodyText"/>
       </w:pPr>
       <w:r>
-        <w:t xml:space="preserve">Detailed values are reported in Supplementary Table S5.</w:t>
+        <w:t xml:space="preserve">Supplementary Table S5 reports the public-primary benchmark strata.</w:t>
       </w:r>
     </w:p>
     <w:p>
@@ -6384,7 +6384,7 @@
         <w:pStyle w:val="BodyText"/>
       </w:pPr>
       <w:r>
-        <w:t xml:space="preserve">Detailed values are reported in Supplementary Table S6.</w:t>
+        <w:t xml:space="preserve">Supplementary Table S6 reports the defense-aware adaptive attack.</w:t>
       </w:r>
     </w:p>
     <w:bookmarkEnd w:id="57"/>

</xml_diff>

<commit_message>
figures: fix overlap and legend layout
</commit_message>
<xml_diff>
--- a/docs/research/paper_v2/manuscript/M3_PI_Guard_JISA_working_draft.docx
+++ b/docs/research/paper_v2/manuscript/M3_PI_Guard_JISA_working_draft.docx
@@ -8003,7 +8003,7 @@
       <w:r>
         <w:drawing>
           <wp:inline>
-            <wp:extent cx="5334000" cy="4317749"/>
+            <wp:extent cx="5334000" cy="3987128"/>
             <wp:effectExtent b="0" l="0" r="0" t="0"/>
             <wp:docPr descr="Figure 3. Paired authorization and mechanism effects." title="" id="1" name="Picture"/>
             <a:graphic>
@@ -8024,7 +8024,7 @@
                   <pic:spPr bwMode="auto">
                     <a:xfrm>
                       <a:off x="0" y="0"/>
-                      <a:ext cx="5334000" cy="4317749"/>
+                      <a:ext cx="5334000" cy="3987128"/>
                     </a:xfrm>
                     <a:prstGeom prst="rect">
                       <a:avLst/>
@@ -19278,13 +19278,19 @@
         <w:t xml:space="preserve"> </w:t>
       </w:r>
       <w:r>
-        <w:t xml:space="preserve">intention-to-treat denominators. Near-identical attack safety can coexist with</w:t>
-      </w:r>
-      <w:r>
-        <w:t xml:space="preserve"> </w:t>
-      </w:r>
-      <w:r>
-        <w:t xml:space="preserve">substantially different utility.</w:t>
+        <w:t xml:space="preserve">intention-to-treat denominators. Numbered markers map to the condition key; a</w:t>
+      </w:r>
+      <w:r>
+        <w:t xml:space="preserve"> </w:t>
+      </w:r>
+      <w:r>
+        <w:t xml:space="preserve">slash joins conditions with exactly coincident coordinates. Near-identical</w:t>
+      </w:r>
+      <w:r>
+        <w:t xml:space="preserve"> </w:t>
+      </w:r>
+      <w:r>
+        <w:t xml:space="preserve">attack safety can coexist with substantially different utility.</w:t>
       </w:r>
     </w:p>
     <w:p>

</xml_diff>

<commit_message>
paper: complete WPS visual QA
</commit_message>
<xml_diff>
--- a/docs/research/paper_v2/manuscript/M3_PI_Guard_JISA_working_draft.docx
+++ b/docs/research/paper_v2/manuscript/M3_PI_Guard_JISA_working_draft.docx
@@ -7,6 +7,7 @@
       <w:pPr>
         <w:pStyle w:val="Heading1"/>
         <w:keepNext/>
+        <w:jc w:val="left"/>
       </w:pPr>
       <w:r>
         <w:t xml:space="preserve">Evaluating Authorization Regimes and Runtime Guardrail Configurations for Tool-Using LLM Agents</w:t>
@@ -17,6 +18,7 @@
       <w:pPr>
         <w:pStyle w:val="Heading2"/>
         <w:keepNext/>
+        <w:jc w:val="left"/>
       </w:pPr>
       <w:r>
         <w:t xml:space="preserve">Abstract</w:t>
@@ -210,6 +212,7 @@
       <w:pPr>
         <w:pStyle w:val="Heading2"/>
         <w:keepNext/>
+        <w:jc w:val="left"/>
       </w:pPr>
       <w:r>
         <w:t xml:space="preserve">1. Introduction</w:t>
@@ -220,6 +223,7 @@
       <w:pPr>
         <w:pStyle w:val="Heading3"/>
         <w:keepNext/>
+        <w:jc w:val="left"/>
       </w:pPr>
       <w:r>
         <w:t xml:space="preserve">1.1 Motivation</w:t>
@@ -394,6 +398,7 @@
       <w:pPr>
         <w:pStyle w:val="Heading3"/>
         <w:keepNext/>
+        <w:jc w:val="left"/>
       </w:pPr>
       <w:r>
         <w:t xml:space="preserve">1.2 Evaluation gap</w:t>
@@ -539,6 +544,7 @@
       <w:pPr>
         <w:pStyle w:val="Heading3"/>
         <w:keepNext/>
+        <w:jc w:val="left"/>
       </w:pPr>
       <w:r>
         <w:t xml:space="preserve">1.3 Research questions</w:t>
@@ -732,6 +738,7 @@
       <w:pPr>
         <w:pStyle w:val="Heading3"/>
         <w:keepNext/>
+        <w:jc w:val="left"/>
       </w:pPr>
       <w:r>
         <w:t xml:space="preserve">1.4 Study design</w:t>
@@ -930,6 +937,7 @@
       <w:pPr>
         <w:pStyle w:val="Heading3"/>
         <w:keepNext/>
+        <w:jc w:val="left"/>
       </w:pPr>
       <w:r>
         <w:t xml:space="preserve">1.5 Empirical motivation and study framing</w:t>
@@ -1123,6 +1131,7 @@
       <w:pPr>
         <w:pStyle w:val="Heading3"/>
         <w:keepNext/>
+        <w:jc w:val="left"/>
       </w:pPr>
       <w:r>
         <w:t xml:space="preserve">1.6 Contributions</w:t>
@@ -1247,6 +1256,7 @@
       <w:pPr>
         <w:pStyle w:val="Heading2"/>
         <w:keepNext/>
+        <w:jc w:val="left"/>
       </w:pPr>
       <w:r>
         <w:t xml:space="preserve">2. Related work</w:t>
@@ -1257,6 +1267,7 @@
       <w:pPr>
         <w:pStyle w:val="Heading3"/>
         <w:keepNext/>
+        <w:jc w:val="left"/>
       </w:pPr>
       <w:r>
         <w:t xml:space="preserve">2.1 Runtime verification and task alignment</w:t>
@@ -1398,6 +1409,7 @@
       <w:pPr>
         <w:pStyle w:val="Heading3"/>
         <w:keepNext/>
+        <w:jc w:val="left"/>
       </w:pPr>
       <w:r>
         <w:t xml:space="preserve">2.2 Privilege, provenance, and information flow</w:t>
@@ -1774,6 +1786,7 @@
       <w:pPr>
         <w:pStyle w:val="Heading3"/>
         <w:keepNext/>
+        <w:jc w:val="left"/>
       </w:pPr>
       <w:r>
         <w:t xml:space="preserve">2.3 Prompt-level defenses and execution-level outcomes</w:t>
@@ -1844,6 +1857,7 @@
       <w:pPr>
         <w:pStyle w:val="Heading3"/>
         <w:keepNext/>
+        <w:jc w:val="left"/>
       </w:pPr>
       <w:r>
         <w:t xml:space="preserve">2.4 Benchmarks and adaptive evaluation</w:t>
@@ -2018,6 +2032,7 @@
       <w:pPr>
         <w:pStyle w:val="Heading3"/>
         <w:keepNext/>
+        <w:jc w:val="left"/>
       </w:pPr>
       <w:r>
         <w:t xml:space="preserve">2.5 Positioning summary</w:t>
@@ -2074,6 +2089,7 @@
       <w:pPr>
         <w:pStyle w:val="Heading2"/>
         <w:keepNext/>
+        <w:jc w:val="left"/>
       </w:pPr>
       <w:r>
         <w:t xml:space="preserve">3. Methods</w:t>
@@ -2084,6 +2100,7 @@
       <w:pPr>
         <w:pStyle w:val="Heading3"/>
         <w:keepNext/>
+        <w:jc w:val="left"/>
       </w:pPr>
       <w:r>
         <w:t xml:space="preserve">3.1 Study design and research questions</w:t>
@@ -2356,6 +2373,7 @@
       <w:pPr>
         <w:pStyle w:val="Heading3"/>
         <w:keepNext/>
+        <w:jc w:val="left"/>
       </w:pPr>
       <w:r>
         <w:t xml:space="preserve">3.2 Threat model and safety boundary</w:t>
@@ -2481,6 +2499,7 @@
       <w:pPr>
         <w:pStyle w:val="Heading3"/>
         <w:keepNext/>
+        <w:jc w:val="left"/>
       </w:pPr>
       <w:r>
         <w:t xml:space="preserve">3.3 Online-state and evaluator separation</w:t>
@@ -2636,6 +2655,7 @@
       <w:pPr>
         <w:pStyle w:val="Heading3"/>
         <w:keepNext/>
+        <w:jc w:val="left"/>
       </w:pPr>
       <w:r>
         <w:t xml:space="preserve">3.4 Runtime conditions</w:t>
@@ -2996,6 +3016,7 @@
       <w:pPr>
         <w:pStyle w:val="Heading3"/>
         <w:keepNext/>
+        <w:jc w:val="left"/>
       </w:pPr>
       <w:r>
         <w:t xml:space="preserve">3.5 Authorization regimes</w:t>
@@ -3328,6 +3349,7 @@
       <w:pPr>
         <w:pStyle w:val="Heading3"/>
         <w:keepNext/>
+        <w:jc w:val="left"/>
       </w:pPr>
       <w:r>
         <w:t xml:space="preserve">3.6 Existing evidence reused without new calls</w:t>
@@ -3459,6 +3481,7 @@
       <w:pPr>
         <w:pStyle w:val="Heading3"/>
         <w:keepNext/>
+        <w:jc w:val="left"/>
       </w:pPr>
       <w:r>
         <w:t xml:space="preserve">3.7 Frozen primary sample</w:t>
@@ -3653,6 +3676,7 @@
       <w:pPr>
         <w:pStyle w:val="Heading3"/>
         <w:keepNext/>
+        <w:jc w:val="left"/>
       </w:pPr>
       <w:r>
         <w:t xml:space="preserve">3.8 Frozen cross-provider sample</w:t>
@@ -3826,6 +3850,7 @@
       <w:pPr>
         <w:pStyle w:val="Heading3"/>
         <w:keepNext/>
+        <w:jc w:val="left"/>
       </w:pPr>
       <w:r>
         <w:t xml:space="preserve">3.9 Providers and model identity</w:t>
@@ -3919,6 +3944,7 @@
       <w:pPr>
         <w:pStyle w:val="Heading3"/>
         <w:keepNext/>
+        <w:jc w:val="left"/>
       </w:pPr>
       <w:r>
         <w:t xml:space="preserve">3.10 Failure and recovery policy</w:t>
@@ -4072,6 +4098,7 @@
       <w:pPr>
         <w:pStyle w:val="Heading3"/>
         <w:keepNext/>
+        <w:jc w:val="left"/>
       </w:pPr>
       <w:r>
         <w:t xml:space="preserve">3.11 Outcomes</w:t>
@@ -4300,6 +4327,7 @@
       <w:pPr>
         <w:pStyle w:val="Heading3"/>
         <w:keepNext/>
+        <w:jc w:val="left"/>
       </w:pPr>
       <w:r>
         <w:t xml:space="preserve">3.12 Statistical analysis</w:t>
@@ -4612,6 +4640,7 @@
       <w:pPr>
         <w:pStyle w:val="Heading3"/>
         <w:keepNext/>
+        <w:jc w:val="left"/>
       </w:pPr>
       <w:r>
         <w:t xml:space="preserve">3.13 Minimal verification and reproducibility</w:t>
@@ -4712,6 +4741,7 @@
       <w:pPr>
         <w:pStyle w:val="Heading2"/>
         <w:keepNext/>
+        <w:jc w:val="left"/>
       </w:pPr>
       <w:r>
         <w:t xml:space="preserve">4. Results</w:t>
@@ -4722,6 +4752,7 @@
       <w:pPr>
         <w:pStyle w:val="Heading3"/>
         <w:keepNext/>
+        <w:jc w:val="left"/>
       </w:pPr>
       <w:r>
         <w:t xml:space="preserve">4.1 Medium falsification study</w:t>
@@ -4996,6 +5027,7 @@
       <w:pPr>
         <w:pStyle w:val="Heading3"/>
         <w:keepNext/>
+        <w:jc w:val="left"/>
       </w:pPr>
       <w:r>
         <w:t xml:space="preserve">4.2 Authorization-regime sensitivity</w:t>
@@ -5102,6 +5134,7 @@
       <w:pPr>
         <w:pStyle w:val="Heading3"/>
         <w:keepNext/>
+        <w:jc w:val="left"/>
       </w:pPr>
       <w:r>
         <w:t xml:space="preserve">4.3 Prespecified decision criteria</w:t>
@@ -5130,6 +5163,7 @@
       </w:tblGrid>
       <w:tr>
         <w:trPr>
+          <w:cantSplit/>
           <w:tblHeader w:val="true"/>
         </w:trPr>
         <w:tc>
@@ -5218,6 +5252,9 @@
         </w:tc>
       </w:tr>
       <w:tr>
+        <w:trPr>
+          <w:cantSplit/>
+        </w:trPr>
         <w:tc>
           <w:tcPr>
             <w:vAlign w:val="center"/>
@@ -5298,6 +5335,9 @@
         </w:tc>
       </w:tr>
       <w:tr>
+        <w:trPr>
+          <w:cantSplit/>
+        </w:trPr>
         <w:tc>
           <w:tcPr>
             <w:vAlign w:val="center"/>
@@ -5378,6 +5418,9 @@
         </w:tc>
       </w:tr>
       <w:tr>
+        <w:trPr>
+          <w:cantSplit/>
+        </w:trPr>
         <w:tc>
           <w:tcPr>
             <w:vAlign w:val="center"/>
@@ -5458,6 +5501,9 @@
         </w:tc>
       </w:tr>
       <w:tr>
+        <w:trPr>
+          <w:cantSplit/>
+        </w:trPr>
         <w:tc>
           <w:tcPr>
             <w:vAlign w:val="center"/>
@@ -5538,6 +5584,9 @@
         </w:tc>
       </w:tr>
       <w:tr>
+        <w:trPr>
+          <w:cantSplit/>
+        </w:trPr>
         <w:tc>
           <w:tcPr>
             <w:vAlign w:val="center"/>
@@ -5618,6 +5667,9 @@
         </w:tc>
       </w:tr>
       <w:tr>
+        <w:trPr>
+          <w:cantSplit/>
+        </w:trPr>
         <w:tc>
           <w:tcPr>
             <w:vAlign w:val="center"/>
@@ -5724,6 +5776,7 @@
       <w:pPr>
         <w:pStyle w:val="Heading3"/>
         <w:keepNext/>
+        <w:jc w:val="left"/>
       </w:pPr>
       <w:r>
         <w:t xml:space="preserve">4.4 Public primary-model result</w:t>
@@ -5907,6 +5960,7 @@
       <w:pPr>
         <w:pStyle w:val="Heading3"/>
         <w:keepNext/>
+        <w:jc w:val="left"/>
       </w:pPr>
       <w:r>
         <w:t xml:space="preserve">4.5 Public DeepSeek V4 Flash replication</w:t>
@@ -6012,6 +6066,7 @@
       <w:pPr>
         <w:pStyle w:val="Heading3"/>
         <w:keepNext/>
+        <w:jc w:val="left"/>
       </w:pPr>
       <w:r>
         <w:t xml:space="preserve">4.6 Public operational and decision burden</w:t>
@@ -6168,6 +6223,7 @@
       <w:pPr>
         <w:pStyle w:val="Heading3"/>
         <w:keepNext/>
+        <w:jc w:val="left"/>
       </w:pPr>
       <w:r>
         <w:t xml:space="preserve">4.7 DeepSeek authorization-regime experiment</w:t>
@@ -6255,6 +6311,7 @@
       <w:pPr>
         <w:pStyle w:val="Heading4"/>
         <w:keepNext/>
+        <w:jc w:val="left"/>
       </w:pPr>
       <w:r>
         <w:t xml:space="preserve">4.7.1 Joint security and utility endpoints</w:t>
@@ -6548,6 +6605,7 @@
       <w:pPr>
         <w:pStyle w:val="Heading4"/>
         <w:keepNext/>
+        <w:jc w:val="left"/>
       </w:pPr>
       <w:r>
         <w:t xml:space="preserve">4.7.2 Benchmark-stratified authorization effects</w:t>
@@ -6645,6 +6703,7 @@
       <w:pPr>
         <w:pStyle w:val="Heading4"/>
         <w:keepNext/>
+        <w:jc w:val="left"/>
       </w:pPr>
       <w:r>
         <w:t xml:space="preserve">4.7.3 Failure-sensitive attack bound</w:t>
@@ -6777,6 +6836,7 @@
       <w:pPr>
         <w:pStyle w:val="Heading4"/>
         <w:keepNext/>
+        <w:jc w:val="left"/>
       </w:pPr>
       <w:r>
         <w:t xml:space="preserve">4.7.4 Stress regimes and operational burden</w:t>
@@ -7064,6 +7124,7 @@
       <w:pPr>
         <w:pStyle w:val="Heading3"/>
         <w:keepNext/>
+        <w:jc w:val="left"/>
       </w:pPr>
       <w:r>
         <w:t xml:space="preserve">4.8 Defense-aware adaptive evidence through budget 200</w:t>
@@ -7186,6 +7247,7 @@
       <w:pPr>
         <w:pStyle w:val="Heading3"/>
         <w:keepNext/>
+        <w:jc w:val="left"/>
       </w:pPr>
       <w:r>
         <w:t xml:space="preserve">4.9 Remaining evidence boundary</w:t>
@@ -7254,6 +7316,7 @@
       <w:pPr>
         <w:pStyle w:val="Heading2"/>
         <w:keepNext/>
+        <w:jc w:val="left"/>
       </w:pPr>
       <w:r>
         <w:t xml:space="preserve">5. Discussion</w:t>
@@ -7264,6 +7327,7 @@
       <w:pPr>
         <w:pStyle w:val="Heading3"/>
         <w:keepNext/>
+        <w:jc w:val="left"/>
       </w:pPr>
       <w:r>
         <w:t xml:space="preserve">5.1 Existing evidence changes the research claim</w:t>
@@ -7393,6 +7457,7 @@
       <w:pPr>
         <w:pStyle w:val="Heading3"/>
         <w:keepNext/>
+        <w:jc w:val="left"/>
       </w:pPr>
       <w:r>
         <w:t xml:space="preserve">5.2 Authorization is part of the treatment</w:t>
@@ -7791,6 +7856,7 @@
       <w:pPr>
         <w:pStyle w:val="Heading3"/>
         <w:keepNext/>
+        <w:jc w:val="left"/>
       </w:pPr>
       <w:r>
         <w:t xml:space="preserve">5.3 Executed effects and utility must be reported together</w:t>
@@ -7928,6 +7994,7 @@
       <w:pPr>
         <w:pStyle w:val="Heading3"/>
         <w:keepNext/>
+        <w:jc w:val="left"/>
       </w:pPr>
       <w:r>
         <w:t xml:space="preserve">5.4 Adaptive evidence is budget-sensitive, not saturated</w:t>
@@ -8012,6 +8079,7 @@
       <w:pPr>
         <w:pStyle w:val="Heading3"/>
         <w:keepNext/>
+        <w:jc w:val="left"/>
       </w:pPr>
       <w:r>
         <w:t xml:space="preserve">5.5 Relation to recent provenance and authorization work</w:t>
@@ -8123,6 +8191,7 @@
       <w:pPr>
         <w:pStyle w:val="Heading3"/>
         <w:keepNext/>
+        <w:jc w:val="left"/>
       </w:pPr>
       <w:r>
         <w:t xml:space="preserve">5.6 Cross-provider interpretation</w:t>
@@ -8204,6 +8273,7 @@
       <w:pPr>
         <w:pStyle w:val="Heading3"/>
         <w:keepNext/>
+        <w:jc w:val="left"/>
       </w:pPr>
       <w:r>
         <w:t xml:space="preserve">5.7 Limitations</w:t>
@@ -8524,6 +8594,7 @@
       <w:pPr>
         <w:pStyle w:val="Heading3"/>
         <w:keepNext/>
+        <w:jc w:val="left"/>
       </w:pPr>
       <w:r>
         <w:t xml:space="preserve">5.8 Practical implications</w:t>
@@ -8624,6 +8695,7 @@
       <w:pPr>
         <w:pStyle w:val="Heading2"/>
         <w:keepNext/>
+        <w:jc w:val="left"/>
       </w:pPr>
       <w:r>
         <w:t xml:space="preserve">6. Conclusion</w:t>
@@ -8847,6 +8919,7 @@
       <w:pPr>
         <w:pStyle w:val="Heading2"/>
         <w:keepNext/>
+        <w:jc w:val="left"/>
       </w:pPr>
       <w:r>
         <w:t xml:space="preserve">Figures</w:t>
@@ -9133,6 +9206,7 @@
       <w:pPr>
         <w:pStyle w:val="Heading2"/>
         <w:keepNext/>
+        <w:jc w:val="left"/>
       </w:pPr>
       <w:r>
         <w:t xml:space="preserve">Tables</w:t>
@@ -9143,6 +9217,7 @@
       <w:pPr>
         <w:pStyle w:val="Heading3"/>
         <w:keepNext/>
+        <w:jc w:val="left"/>
       </w:pPr>
       <w:r>
         <w:t xml:space="preserve">Table 1. Experimental design</w:t>
@@ -9181,6 +9256,7 @@
       </w:tblGrid>
       <w:tr>
         <w:trPr>
+          <w:cantSplit/>
           <w:tblHeader w:val="true"/>
         </w:trPr>
         <w:tc>
@@ -9325,6 +9401,9 @@
         </w:tc>
       </w:tr>
       <w:tr>
+        <w:trPr>
+          <w:cantSplit/>
+        </w:trPr>
         <w:tc>
           <w:tcPr>
             <w:vAlign w:val="center"/>
@@ -9457,6 +9536,9 @@
         </w:tc>
       </w:tr>
       <w:tr>
+        <w:trPr>
+          <w:cantSplit/>
+        </w:trPr>
         <w:tc>
           <w:tcPr>
             <w:vAlign w:val="center"/>
@@ -9589,6 +9671,9 @@
         </w:tc>
       </w:tr>
       <w:tr>
+        <w:trPr>
+          <w:cantSplit/>
+        </w:trPr>
         <w:tc>
           <w:tcPr>
             <w:vAlign w:val="center"/>
@@ -9721,6 +9806,9 @@
         </w:tc>
       </w:tr>
       <w:tr>
+        <w:trPr>
+          <w:cantSplit/>
+        </w:trPr>
         <w:tc>
           <w:tcPr>
             <w:vAlign w:val="center"/>
@@ -9853,6 +9941,9 @@
         </w:tc>
       </w:tr>
       <w:tr>
+        <w:trPr>
+          <w:cantSplit/>
+        </w:trPr>
         <w:tc>
           <w:tcPr>
             <w:vAlign w:val="center"/>
@@ -9985,6 +10076,9 @@
         </w:tc>
       </w:tr>
       <w:tr>
+        <w:trPr>
+          <w:cantSplit/>
+        </w:trPr>
         <w:tc>
           <w:tcPr>
             <w:vAlign w:val="center"/>
@@ -10117,6 +10211,9 @@
         </w:tc>
       </w:tr>
       <w:tr>
+        <w:trPr>
+          <w:cantSplit/>
+        </w:trPr>
         <w:tc>
           <w:tcPr>
             <w:vAlign w:val="center"/>
@@ -10249,6 +10346,9 @@
         </w:tc>
       </w:tr>
       <w:tr>
+        <w:trPr>
+          <w:cantSplit/>
+        </w:trPr>
         <w:tc>
           <w:tcPr>
             <w:vAlign w:val="center"/>
@@ -10381,6 +10481,9 @@
         </w:tc>
       </w:tr>
       <w:tr>
+        <w:trPr>
+          <w:cantSplit/>
+        </w:trPr>
         <w:tc>
           <w:tcPr>
             <w:vAlign w:val="center"/>
@@ -10513,6 +10616,9 @@
         </w:tc>
       </w:tr>
       <w:tr>
+        <w:trPr>
+          <w:cantSplit/>
+        </w:trPr>
         <w:tc>
           <w:tcPr>
             <w:vAlign w:val="center"/>
@@ -10651,6 +10757,7 @@
       <w:pPr>
         <w:pStyle w:val="Heading3"/>
         <w:keepNext/>
+        <w:jc w:val="left"/>
       </w:pPr>
       <w:r>
         <w:t xml:space="preserve">Table 2. Joint primary endpoints</w:t>
@@ -10690,6 +10797,7 @@
       </w:tblGrid>
       <w:tr>
         <w:trPr>
+          <w:cantSplit/>
           <w:tblHeader w:val="true"/>
         </w:trPr>
         <w:tc>
@@ -10862,6 +10970,9 @@
         </w:tc>
       </w:tr>
       <w:tr>
+        <w:trPr>
+          <w:cantSplit/>
+        </w:trPr>
         <w:tc>
           <w:tcPr>
             <w:vAlign w:val="center"/>
@@ -11020,6 +11131,9 @@
         </w:tc>
       </w:tr>
       <w:tr>
+        <w:trPr>
+          <w:cantSplit/>
+        </w:trPr>
         <w:tc>
           <w:tcPr>
             <w:vAlign w:val="center"/>
@@ -11178,6 +11292,9 @@
         </w:tc>
       </w:tr>
       <w:tr>
+        <w:trPr>
+          <w:cantSplit/>
+        </w:trPr>
         <w:tc>
           <w:tcPr>
             <w:vAlign w:val="center"/>
@@ -11336,6 +11453,9 @@
         </w:tc>
       </w:tr>
       <w:tr>
+        <w:trPr>
+          <w:cantSplit/>
+        </w:trPr>
         <w:tc>
           <w:tcPr>
             <w:vAlign w:val="center"/>
@@ -11494,6 +11614,9 @@
         </w:tc>
       </w:tr>
       <w:tr>
+        <w:trPr>
+          <w:cantSplit/>
+        </w:trPr>
         <w:tc>
           <w:tcPr>
             <w:vAlign w:val="center"/>
@@ -11652,6 +11775,9 @@
         </w:tc>
       </w:tr>
       <w:tr>
+        <w:trPr>
+          <w:cantSplit/>
+        </w:trPr>
         <w:tc>
           <w:tcPr>
             <w:vAlign w:val="center"/>
@@ -11810,6 +11936,9 @@
         </w:tc>
       </w:tr>
       <w:tr>
+        <w:trPr>
+          <w:cantSplit/>
+        </w:trPr>
         <w:tc>
           <w:tcPr>
             <w:vAlign w:val="center"/>
@@ -11974,6 +12103,7 @@
       <w:pPr>
         <w:pStyle w:val="Heading3"/>
         <w:keepNext/>
+        <w:jc w:val="left"/>
       </w:pPr>
       <w:r>
         <w:t xml:space="preserve">Table 3. Paired authorization and configuration-package effects</w:t>
@@ -12016,6 +12146,7 @@
       </w:tblGrid>
       <w:tr>
         <w:trPr>
+          <w:cantSplit/>
           <w:tblHeader w:val="true"/>
         </w:trPr>
         <w:tc>
@@ -12272,6 +12403,9 @@
         </w:tc>
       </w:tr>
       <w:tr>
+        <w:trPr>
+          <w:cantSplit/>
+        </w:trPr>
         <w:tc>
           <w:tcPr>
             <w:vAlign w:val="center"/>
@@ -12508,6 +12642,9 @@
         </w:tc>
       </w:tr>
       <w:tr>
+        <w:trPr>
+          <w:cantSplit/>
+        </w:trPr>
         <w:tc>
           <w:tcPr>
             <w:vAlign w:val="center"/>
@@ -12744,6 +12881,9 @@
         </w:tc>
       </w:tr>
       <w:tr>
+        <w:trPr>
+          <w:cantSplit/>
+        </w:trPr>
         <w:tc>
           <w:tcPr>
             <w:vAlign w:val="center"/>
@@ -12980,6 +13120,9 @@
         </w:tc>
       </w:tr>
       <w:tr>
+        <w:trPr>
+          <w:cantSplit/>
+        </w:trPr>
         <w:tc>
           <w:tcPr>
             <w:vAlign w:val="center"/>
@@ -13216,6 +13359,9 @@
         </w:tc>
       </w:tr>
       <w:tr>
+        <w:trPr>
+          <w:cantSplit/>
+        </w:trPr>
         <w:tc>
           <w:tcPr>
             <w:vAlign w:val="center"/>
@@ -13452,6 +13598,9 @@
         </w:tc>
       </w:tr>
       <w:tr>
+        <w:trPr>
+          <w:cantSplit/>
+        </w:trPr>
         <w:tc>
           <w:tcPr>
             <w:vAlign w:val="center"/>
@@ -13688,6 +13837,9 @@
         </w:tc>
       </w:tr>
       <w:tr>
+        <w:trPr>
+          <w:cantSplit/>
+        </w:trPr>
         <w:tc>
           <w:tcPr>
             <w:vAlign w:val="center"/>
@@ -13924,6 +14076,9 @@
         </w:tc>
       </w:tr>
       <w:tr>
+        <w:trPr>
+          <w:cantSplit/>
+        </w:trPr>
         <w:tc>
           <w:tcPr>
             <w:vAlign w:val="center"/>
@@ -14160,6 +14315,9 @@
         </w:tc>
       </w:tr>
       <w:tr>
+        <w:trPr>
+          <w:cantSplit/>
+        </w:trPr>
         <w:tc>
           <w:tcPr>
             <w:vAlign w:val="center"/>
@@ -14396,6 +14554,9 @@
         </w:tc>
       </w:tr>
       <w:tr>
+        <w:trPr>
+          <w:cantSplit/>
+        </w:trPr>
         <w:tc>
           <w:tcPr>
             <w:vAlign w:val="center"/>
@@ -14632,6 +14793,9 @@
         </w:tc>
       </w:tr>
       <w:tr>
+        <w:trPr>
+          <w:cantSplit/>
+        </w:trPr>
         <w:tc>
           <w:tcPr>
             <w:vAlign w:val="center"/>
@@ -14868,6 +15032,9 @@
         </w:tc>
       </w:tr>
       <w:tr>
+        <w:trPr>
+          <w:cantSplit/>
+        </w:trPr>
         <w:tc>
           <w:tcPr>
             <w:vAlign w:val="center"/>
@@ -15104,6 +15271,9 @@
         </w:tc>
       </w:tr>
       <w:tr>
+        <w:trPr>
+          <w:cantSplit/>
+        </w:trPr>
         <w:tc>
           <w:tcPr>
             <w:vAlign w:val="center"/>
@@ -15340,6 +15510,9 @@
         </w:tc>
       </w:tr>
       <w:tr>
+        <w:trPr>
+          <w:cantSplit/>
+        </w:trPr>
         <w:tc>
           <w:tcPr>
             <w:vAlign w:val="center"/>
@@ -15582,6 +15755,7 @@
       <w:pPr>
         <w:pStyle w:val="Heading3"/>
         <w:keepNext/>
+        <w:jc w:val="left"/>
       </w:pPr>
       <w:r>
         <w:t xml:space="preserve">Table 4. Runtime burden</w:t>
@@ -15624,6 +15798,7 @@
       </w:tblGrid>
       <w:tr>
         <w:trPr>
+          <w:cantSplit/>
           <w:tblHeader w:val="true"/>
         </w:trPr>
         <w:tc>
@@ -15880,6 +16055,9 @@
         </w:tc>
       </w:tr>
       <w:tr>
+        <w:trPr>
+          <w:cantSplit/>
+        </w:trPr>
         <w:tc>
           <w:tcPr>
             <w:vAlign w:val="center"/>
@@ -16116,6 +16294,9 @@
         </w:tc>
       </w:tr>
       <w:tr>
+        <w:trPr>
+          <w:cantSplit/>
+        </w:trPr>
         <w:tc>
           <w:tcPr>
             <w:vAlign w:val="center"/>
@@ -16352,6 +16533,9 @@
         </w:tc>
       </w:tr>
       <w:tr>
+        <w:trPr>
+          <w:cantSplit/>
+        </w:trPr>
         <w:tc>
           <w:tcPr>
             <w:vAlign w:val="center"/>
@@ -16588,6 +16772,9 @@
         </w:tc>
       </w:tr>
       <w:tr>
+        <w:trPr>
+          <w:cantSplit/>
+        </w:trPr>
         <w:tc>
           <w:tcPr>
             <w:vAlign w:val="center"/>
@@ -16824,6 +17011,9 @@
         </w:tc>
       </w:tr>
       <w:tr>
+        <w:trPr>
+          <w:cantSplit/>
+        </w:trPr>
         <w:tc>
           <w:tcPr>
             <w:vAlign w:val="center"/>
@@ -17060,6 +17250,9 @@
         </w:tc>
       </w:tr>
       <w:tr>
+        <w:trPr>
+          <w:cantSplit/>
+        </w:trPr>
         <w:tc>
           <w:tcPr>
             <w:vAlign w:val="center"/>
@@ -17296,6 +17489,9 @@
         </w:tc>
       </w:tr>
       <w:tr>
+        <w:trPr>
+          <w:cantSplit/>
+        </w:trPr>
         <w:tc>
           <w:tcPr>
             <w:vAlign w:val="center"/>
@@ -17538,6 +17734,7 @@
       <w:pPr>
         <w:pStyle w:val="Heading3"/>
         <w:keepNext/>
+        <w:jc w:val="left"/>
       </w:pPr>
       <w:r>
         <w:t xml:space="preserve">Table 5. Benchmark-stratified paired estimates</w:t>
@@ -17580,6 +17777,7 @@
       </w:tblGrid>
       <w:tr>
         <w:trPr>
+          <w:cantSplit/>
           <w:tblHeader w:val="true"/>
         </w:trPr>
         <w:tc>
@@ -17836,6 +18034,9 @@
         </w:tc>
       </w:tr>
       <w:tr>
+        <w:trPr>
+          <w:cantSplit/>
+        </w:trPr>
         <w:tc>
           <w:tcPr>
             <w:vAlign w:val="center"/>
@@ -18072,6 +18273,9 @@
         </w:tc>
       </w:tr>
       <w:tr>
+        <w:trPr>
+          <w:cantSplit/>
+        </w:trPr>
         <w:tc>
           <w:tcPr>
             <w:vAlign w:val="center"/>
@@ -18308,6 +18512,9 @@
         </w:tc>
       </w:tr>
       <w:tr>
+        <w:trPr>
+          <w:cantSplit/>
+        </w:trPr>
         <w:tc>
           <w:tcPr>
             <w:vAlign w:val="center"/>
@@ -18544,6 +18751,9 @@
         </w:tc>
       </w:tr>
       <w:tr>
+        <w:trPr>
+          <w:cantSplit/>
+        </w:trPr>
         <w:tc>
           <w:tcPr>
             <w:vAlign w:val="center"/>
@@ -18780,6 +18990,9 @@
         </w:tc>
       </w:tr>
       <w:tr>
+        <w:trPr>
+          <w:cantSplit/>
+        </w:trPr>
         <w:tc>
           <w:tcPr>
             <w:vAlign w:val="center"/>
@@ -19016,6 +19229,9 @@
         </w:tc>
       </w:tr>
       <w:tr>
+        <w:trPr>
+          <w:cantSplit/>
+        </w:trPr>
         <w:tc>
           <w:tcPr>
             <w:vAlign w:val="center"/>
@@ -19252,6 +19468,9 @@
         </w:tc>
       </w:tr>
       <w:tr>
+        <w:trPr>
+          <w:cantSplit/>
+        </w:trPr>
         <w:tc>
           <w:tcPr>
             <w:vAlign w:val="center"/>
@@ -19488,6 +19707,9 @@
         </w:tc>
       </w:tr>
       <w:tr>
+        <w:trPr>
+          <w:cantSplit/>
+        </w:trPr>
         <w:tc>
           <w:tcPr>
             <w:vAlign w:val="center"/>
@@ -19724,6 +19946,9 @@
         </w:tc>
       </w:tr>
       <w:tr>
+        <w:trPr>
+          <w:cantSplit/>
+        </w:trPr>
         <w:tc>
           <w:tcPr>
             <w:vAlign w:val="center"/>
@@ -19960,6 +20185,9 @@
         </w:tc>
       </w:tr>
       <w:tr>
+        <w:trPr>
+          <w:cantSplit/>
+        </w:trPr>
         <w:tc>
           <w:tcPr>
             <w:vAlign w:val="center"/>
@@ -20196,6 +20424,9 @@
         </w:tc>
       </w:tr>
       <w:tr>
+        <w:trPr>
+          <w:cantSplit/>
+        </w:trPr>
         <w:tc>
           <w:tcPr>
             <w:vAlign w:val="center"/>
@@ -20432,6 +20663,9 @@
         </w:tc>
       </w:tr>
       <w:tr>
+        <w:trPr>
+          <w:cantSplit/>
+        </w:trPr>
         <w:tc>
           <w:tcPr>
             <w:vAlign w:val="center"/>
@@ -20668,6 +20902,9 @@
         </w:tc>
       </w:tr>
       <w:tr>
+        <w:trPr>
+          <w:cantSplit/>
+        </w:trPr>
         <w:tc>
           <w:tcPr>
             <w:vAlign w:val="center"/>
@@ -20904,6 +21141,9 @@
         </w:tc>
       </w:tr>
       <w:tr>
+        <w:trPr>
+          <w:cantSplit/>
+        </w:trPr>
         <w:tc>
           <w:tcPr>
             <w:vAlign w:val="center"/>
@@ -21140,6 +21380,9 @@
         </w:tc>
       </w:tr>
       <w:tr>
+        <w:trPr>
+          <w:cantSplit/>
+        </w:trPr>
         <w:tc>
           <w:tcPr>
             <w:vAlign w:val="center"/>
@@ -21376,6 +21619,9 @@
         </w:tc>
       </w:tr>
       <w:tr>
+        <w:trPr>
+          <w:cantSplit/>
+        </w:trPr>
         <w:tc>
           <w:tcPr>
             <w:vAlign w:val="center"/>
@@ -21618,6 +21864,7 @@
       <w:pPr>
         <w:pStyle w:val="Heading3"/>
         <w:keepNext/>
+        <w:jc w:val="left"/>
       </w:pPr>
       <w:r>
         <w:t xml:space="preserve">Table 6. Adaptive evidence at budgets 50 and 200</w:t>
@@ -21657,6 +21904,7 @@
       </w:tblGrid>
       <w:tr>
         <w:trPr>
+          <w:cantSplit/>
           <w:tblHeader w:val="true"/>
         </w:trPr>
         <w:tc>
@@ -21829,6 +22077,9 @@
         </w:tc>
       </w:tr>
       <w:tr>
+        <w:trPr>
+          <w:cantSplit/>
+        </w:trPr>
         <w:tc>
           <w:tcPr>
             <w:vAlign w:val="center"/>
@@ -21987,6 +22238,9 @@
         </w:tc>
       </w:tr>
       <w:tr>
+        <w:trPr>
+          <w:cantSplit/>
+        </w:trPr>
         <w:tc>
           <w:tcPr>
             <w:vAlign w:val="center"/>
@@ -22152,6 +22406,7 @@
       <w:pPr>
         <w:pStyle w:val="Heading2"/>
         <w:keepNext/>
+        <w:jc w:val="left"/>
       </w:pPr>
       <w:r>
         <w:t xml:space="preserve">Figure captions</w:t>
@@ -22418,6 +22673,7 @@
       <w:pPr>
         <w:pStyle w:val="Heading2"/>
         <w:keepNext/>
+        <w:jc w:val="left"/>
       </w:pPr>
       <w:r>
         <w:t xml:space="preserve">Submission statements</w:t>
@@ -22428,6 +22684,7 @@
       <w:pPr>
         <w:pStyle w:val="Heading3"/>
         <w:keepNext/>
+        <w:jc w:val="left"/>
       </w:pPr>
       <w:r>
         <w:t xml:space="preserve">Competing interests</w:t>
@@ -22453,6 +22710,7 @@
       <w:pPr>
         <w:pStyle w:val="Heading3"/>
         <w:keepNext/>
+        <w:jc w:val="left"/>
       </w:pPr>
       <w:r>
         <w:t xml:space="preserve">Funding</w:t>
@@ -22484,6 +22742,7 @@
       <w:pPr>
         <w:pStyle w:val="Heading3"/>
         <w:keepNext/>
+        <w:jc w:val="left"/>
       </w:pPr>
       <w:r>
         <w:t xml:space="preserve">Data and code availability</w:t>
@@ -22539,6 +22798,7 @@
       <w:pPr>
         <w:pStyle w:val="Heading3"/>
         <w:keepNext/>
+        <w:jc w:val="left"/>
       </w:pPr>
       <w:r>
         <w:t xml:space="preserve">Declaration of generative AI and AI-assisted technologies in the manuscript preparation process</w:t>
@@ -22600,6 +22860,7 @@
       <w:pPr>
         <w:pStyle w:val="Heading3"/>
         <w:keepNext/>
+        <w:jc w:val="left"/>
       </w:pPr>
       <w:r>
         <w:t xml:space="preserve">Ethics and safety</w:t>
@@ -22643,6 +22904,7 @@
       <w:pPr>
         <w:pStyle w:val="Heading3"/>
         <w:keepNext/>
+        <w:jc w:val="left"/>
       </w:pPr>
       <w:r>
         <w:t xml:space="preserve">Author contributions</w:t>
@@ -22669,6 +22931,7 @@
       <w:pPr>
         <w:pStyle w:val="Heading2"/>
         <w:keepNext/>
+        <w:jc w:val="left"/>
       </w:pPr>
       <w:r>
         <w:t xml:space="preserve">References</w:t>

</xml_diff>